<commit_message>
docs(formal): update the AI development document after #15 and #17
The wireframes folder (decision 0041), the local migration check, the
agent never linking the Supabase project, the new permission blocks
and the Supabase CLI in the tools table.

Co-Authored-By: Claude Opus 5.5 <noreply@anthropic.com>
</commit_message>
<xml_diff>
--- a/documentos-formais/DesenvolvimentoComIA.docx
+++ b/documentos-formais/DesenvolvimentoComIA.docx
@@ -240,7 +240,7 @@
       <w:r>
         <w:fldChar w:fldCharType="separate"/>
       </w:r>
-      <w:hyperlink w:anchor="_Toc243219212" w:history="1">
+      <w:hyperlink w:anchor="_Toc243258014" w:history="1">
         <w:r>
           <w:rPr>
             <w:rStyle w:val="Hyperlink"/>
@@ -263,7 +263,7 @@
           <w:rPr>
             <w:webHidden/>
           </w:rPr>
-          <w:instrText xml:space="preserve"> PAGEREF _Toc243219212 \h </w:instrText>
+          <w:instrText xml:space="preserve"> PAGEREF _Toc243258014 \h </w:instrText>
         </w:r>
         <w:r>
           <w:rPr>
@@ -298,7 +298,7 @@
           <w:lang w:eastAsia="pt-BR"/>
         </w:rPr>
       </w:pPr>
-      <w:hyperlink w:anchor="_Toc243219213" w:history="1">
+      <w:hyperlink w:anchor="_Toc243258015" w:history="1">
         <w:r>
           <w:rPr>
             <w:rStyle w:val="Hyperlink"/>
@@ -321,7 +321,7 @@
           <w:rPr>
             <w:webHidden/>
           </w:rPr>
-          <w:instrText xml:space="preserve"> PAGEREF _Toc243219213 \h </w:instrText>
+          <w:instrText xml:space="preserve"> PAGEREF _Toc243258015 \h </w:instrText>
         </w:r>
         <w:r>
           <w:rPr>
@@ -358,7 +358,7 @@
           <w:lang w:eastAsia="pt-BR"/>
         </w:rPr>
       </w:pPr>
-      <w:hyperlink w:anchor="_Toc243219214" w:history="1">
+      <w:hyperlink w:anchor="_Toc243258016" w:history="1">
         <w:r>
           <w:rPr>
             <w:rStyle w:val="Hyperlink"/>
@@ -381,7 +381,7 @@
           <w:rPr>
             <w:webHidden/>
           </w:rPr>
-          <w:instrText xml:space="preserve"> PAGEREF _Toc243219214 \h </w:instrText>
+          <w:instrText xml:space="preserve"> PAGEREF _Toc243258016 \h </w:instrText>
         </w:r>
         <w:r>
           <w:rPr>
@@ -416,7 +416,7 @@
           <w:lang w:eastAsia="pt-BR"/>
         </w:rPr>
       </w:pPr>
-      <w:hyperlink w:anchor="_Toc243219215" w:history="1">
+      <w:hyperlink w:anchor="_Toc243258017" w:history="1">
         <w:r>
           <w:rPr>
             <w:rStyle w:val="Hyperlink"/>
@@ -439,7 +439,7 @@
           <w:rPr>
             <w:webHidden/>
           </w:rPr>
-          <w:instrText xml:space="preserve"> PAGEREF _Toc243219215 \h </w:instrText>
+          <w:instrText xml:space="preserve"> PAGEREF _Toc243258017 \h </w:instrText>
         </w:r>
         <w:r>
           <w:rPr>
@@ -474,7 +474,7 @@
           <w:lang w:eastAsia="pt-BR"/>
         </w:rPr>
       </w:pPr>
-      <w:hyperlink w:anchor="_Toc243219216" w:history="1">
+      <w:hyperlink w:anchor="_Toc243258018" w:history="1">
         <w:r>
           <w:rPr>
             <w:rStyle w:val="Hyperlink"/>
@@ -497,7 +497,7 @@
           <w:rPr>
             <w:webHidden/>
           </w:rPr>
-          <w:instrText xml:space="preserve"> PAGEREF _Toc243219216 \h </w:instrText>
+          <w:instrText xml:space="preserve"> PAGEREF _Toc243258018 \h </w:instrText>
         </w:r>
         <w:r>
           <w:rPr>
@@ -532,7 +532,7 @@
           <w:lang w:eastAsia="pt-BR"/>
         </w:rPr>
       </w:pPr>
-      <w:hyperlink w:anchor="_Toc243219217" w:history="1">
+      <w:hyperlink w:anchor="_Toc243258019" w:history="1">
         <w:r>
           <w:rPr>
             <w:rStyle w:val="Hyperlink"/>
@@ -555,7 +555,7 @@
           <w:rPr>
             <w:webHidden/>
           </w:rPr>
-          <w:instrText xml:space="preserve"> PAGEREF _Toc243219217 \h </w:instrText>
+          <w:instrText xml:space="preserve"> PAGEREF _Toc243258019 \h </w:instrText>
         </w:r>
         <w:r>
           <w:rPr>
@@ -590,7 +590,7 @@
           <w:lang w:eastAsia="pt-BR"/>
         </w:rPr>
       </w:pPr>
-      <w:hyperlink w:anchor="_Toc243219218" w:history="1">
+      <w:hyperlink w:anchor="_Toc243258020" w:history="1">
         <w:r>
           <w:rPr>
             <w:rStyle w:val="Hyperlink"/>
@@ -613,7 +613,7 @@
           <w:rPr>
             <w:webHidden/>
           </w:rPr>
-          <w:instrText xml:space="preserve"> PAGEREF _Toc243219218 \h </w:instrText>
+          <w:instrText xml:space="preserve"> PAGEREF _Toc243258020 \h </w:instrText>
         </w:r>
         <w:r>
           <w:rPr>
@@ -650,7 +650,7 @@
           <w:lang w:eastAsia="pt-BR"/>
         </w:rPr>
       </w:pPr>
-      <w:hyperlink w:anchor="_Toc243219219" w:history="1">
+      <w:hyperlink w:anchor="_Toc243258021" w:history="1">
         <w:r>
           <w:rPr>
             <w:rStyle w:val="Hyperlink"/>
@@ -673,7 +673,7 @@
           <w:rPr>
             <w:webHidden/>
           </w:rPr>
-          <w:instrText xml:space="preserve"> PAGEREF _Toc243219219 \h </w:instrText>
+          <w:instrText xml:space="preserve"> PAGEREF _Toc243258021 \h </w:instrText>
         </w:r>
         <w:r>
           <w:rPr>
@@ -708,7 +708,7 @@
           <w:lang w:eastAsia="pt-BR"/>
         </w:rPr>
       </w:pPr>
-      <w:hyperlink w:anchor="_Toc243219220" w:history="1">
+      <w:hyperlink w:anchor="_Toc243258022" w:history="1">
         <w:r>
           <w:rPr>
             <w:rStyle w:val="Hyperlink"/>
@@ -731,7 +731,7 @@
           <w:rPr>
             <w:webHidden/>
           </w:rPr>
-          <w:instrText xml:space="preserve"> PAGEREF _Toc243219220 \h </w:instrText>
+          <w:instrText xml:space="preserve"> PAGEREF _Toc243258022 \h </w:instrText>
         </w:r>
         <w:r>
           <w:rPr>
@@ -766,7 +766,7 @@
           <w:lang w:eastAsia="pt-BR"/>
         </w:rPr>
       </w:pPr>
-      <w:hyperlink w:anchor="_Toc243219221" w:history="1">
+      <w:hyperlink w:anchor="_Toc243258023" w:history="1">
         <w:r>
           <w:rPr>
             <w:rStyle w:val="Hyperlink"/>
@@ -789,7 +789,7 @@
           <w:rPr>
             <w:webHidden/>
           </w:rPr>
-          <w:instrText xml:space="preserve"> PAGEREF _Toc243219221 \h </w:instrText>
+          <w:instrText xml:space="preserve"> PAGEREF _Toc243258023 \h </w:instrText>
         </w:r>
         <w:r>
           <w:rPr>
@@ -824,7 +824,7 @@
           <w:lang w:eastAsia="pt-BR"/>
         </w:rPr>
       </w:pPr>
-      <w:hyperlink w:anchor="_Toc243219222" w:history="1">
+      <w:hyperlink w:anchor="_Toc243258024" w:history="1">
         <w:r>
           <w:rPr>
             <w:rStyle w:val="Hyperlink"/>
@@ -847,7 +847,7 @@
           <w:rPr>
             <w:webHidden/>
           </w:rPr>
-          <w:instrText xml:space="preserve"> PAGEREF _Toc243219222 \h </w:instrText>
+          <w:instrText xml:space="preserve"> PAGEREF _Toc243258024 \h </w:instrText>
         </w:r>
         <w:r>
           <w:rPr>
@@ -882,7 +882,7 @@
           <w:lang w:eastAsia="pt-BR"/>
         </w:rPr>
       </w:pPr>
-      <w:hyperlink w:anchor="_Toc243219223" w:history="1">
+      <w:hyperlink w:anchor="_Toc243258025" w:history="1">
         <w:r>
           <w:rPr>
             <w:rStyle w:val="Hyperlink"/>
@@ -905,7 +905,7 @@
           <w:rPr>
             <w:webHidden/>
           </w:rPr>
-          <w:instrText xml:space="preserve"> PAGEREF _Toc243219223 \h </w:instrText>
+          <w:instrText xml:space="preserve"> PAGEREF _Toc243258025 \h </w:instrText>
         </w:r>
         <w:r>
           <w:rPr>
@@ -940,7 +940,7 @@
           <w:lang w:eastAsia="pt-BR"/>
         </w:rPr>
       </w:pPr>
-      <w:hyperlink w:anchor="_Toc243219224" w:history="1">
+      <w:hyperlink w:anchor="_Toc243258026" w:history="1">
         <w:r>
           <w:rPr>
             <w:rStyle w:val="Hyperlink"/>
@@ -963,7 +963,7 @@
           <w:rPr>
             <w:webHidden/>
           </w:rPr>
-          <w:instrText xml:space="preserve"> PAGEREF _Toc243219224 \h </w:instrText>
+          <w:instrText xml:space="preserve"> PAGEREF _Toc243258026 \h </w:instrText>
         </w:r>
         <w:r>
           <w:rPr>
@@ -998,7 +998,7 @@
           <w:lang w:eastAsia="pt-BR"/>
         </w:rPr>
       </w:pPr>
-      <w:hyperlink w:anchor="_Toc243219225" w:history="1">
+      <w:hyperlink w:anchor="_Toc243258027" w:history="1">
         <w:r>
           <w:rPr>
             <w:rStyle w:val="Hyperlink"/>
@@ -1021,7 +1021,7 @@
           <w:rPr>
             <w:webHidden/>
           </w:rPr>
-          <w:instrText xml:space="preserve"> PAGEREF _Toc243219225 \h </w:instrText>
+          <w:instrText xml:space="preserve"> PAGEREF _Toc243258027 \h </w:instrText>
         </w:r>
         <w:r>
           <w:rPr>
@@ -1058,7 +1058,7 @@
           <w:lang w:eastAsia="pt-BR"/>
         </w:rPr>
       </w:pPr>
-      <w:hyperlink w:anchor="_Toc243219226" w:history="1">
+      <w:hyperlink w:anchor="_Toc243258028" w:history="1">
         <w:r>
           <w:rPr>
             <w:rStyle w:val="Hyperlink"/>
@@ -1081,7 +1081,7 @@
           <w:rPr>
             <w:webHidden/>
           </w:rPr>
-          <w:instrText xml:space="preserve"> PAGEREF _Toc243219226 \h </w:instrText>
+          <w:instrText xml:space="preserve"> PAGEREF _Toc243258028 \h </w:instrText>
         </w:r>
         <w:r>
           <w:rPr>
@@ -1116,7 +1116,7 @@
           <w:lang w:eastAsia="pt-BR"/>
         </w:rPr>
       </w:pPr>
-      <w:hyperlink w:anchor="_Toc243219227" w:history="1">
+      <w:hyperlink w:anchor="_Toc243258029" w:history="1">
         <w:r>
           <w:rPr>
             <w:rStyle w:val="Hyperlink"/>
@@ -1139,7 +1139,7 @@
           <w:rPr>
             <w:webHidden/>
           </w:rPr>
-          <w:instrText xml:space="preserve"> PAGEREF _Toc243219227 \h </w:instrText>
+          <w:instrText xml:space="preserve"> PAGEREF _Toc243258029 \h </w:instrText>
         </w:r>
         <w:r>
           <w:rPr>
@@ -1174,7 +1174,7 @@
           <w:lang w:eastAsia="pt-BR"/>
         </w:rPr>
       </w:pPr>
-      <w:hyperlink w:anchor="_Toc243219228" w:history="1">
+      <w:hyperlink w:anchor="_Toc243258030" w:history="1">
         <w:r>
           <w:rPr>
             <w:rStyle w:val="Hyperlink"/>
@@ -1197,7 +1197,7 @@
           <w:rPr>
             <w:webHidden/>
           </w:rPr>
-          <w:instrText xml:space="preserve"> PAGEREF _Toc243219228 \h </w:instrText>
+          <w:instrText xml:space="preserve"> PAGEREF _Toc243258030 \h </w:instrText>
         </w:r>
         <w:r>
           <w:rPr>
@@ -1234,7 +1234,7 @@
           <w:lang w:eastAsia="pt-BR"/>
         </w:rPr>
       </w:pPr>
-      <w:hyperlink w:anchor="_Toc243219229" w:history="1">
+      <w:hyperlink w:anchor="_Toc243258031" w:history="1">
         <w:r>
           <w:rPr>
             <w:rStyle w:val="Hyperlink"/>
@@ -1257,7 +1257,7 @@
           <w:rPr>
             <w:webHidden/>
           </w:rPr>
-          <w:instrText xml:space="preserve"> PAGEREF _Toc243219229 \h </w:instrText>
+          <w:instrText xml:space="preserve"> PAGEREF _Toc243258031 \h </w:instrText>
         </w:r>
         <w:r>
           <w:rPr>
@@ -1292,7 +1292,7 @@
           <w:lang w:eastAsia="pt-BR"/>
         </w:rPr>
       </w:pPr>
-      <w:hyperlink w:anchor="_Toc243219230" w:history="1">
+      <w:hyperlink w:anchor="_Toc243258032" w:history="1">
         <w:r>
           <w:rPr>
             <w:rStyle w:val="Hyperlink"/>
@@ -1315,7 +1315,7 @@
           <w:rPr>
             <w:webHidden/>
           </w:rPr>
-          <w:instrText xml:space="preserve"> PAGEREF _Toc243219230 \h </w:instrText>
+          <w:instrText xml:space="preserve"> PAGEREF _Toc243258032 \h </w:instrText>
         </w:r>
         <w:r>
           <w:rPr>
@@ -1350,7 +1350,7 @@
           <w:lang w:eastAsia="pt-BR"/>
         </w:rPr>
       </w:pPr>
-      <w:hyperlink w:anchor="_Toc243219231" w:history="1">
+      <w:hyperlink w:anchor="_Toc243258033" w:history="1">
         <w:r>
           <w:rPr>
             <w:rStyle w:val="Hyperlink"/>
@@ -1373,7 +1373,7 @@
           <w:rPr>
             <w:webHidden/>
           </w:rPr>
-          <w:instrText xml:space="preserve"> PAGEREF _Toc243219231 \h </w:instrText>
+          <w:instrText xml:space="preserve"> PAGEREF _Toc243258033 \h </w:instrText>
         </w:r>
         <w:r>
           <w:rPr>
@@ -1408,7 +1408,7 @@
           <w:lang w:eastAsia="pt-BR"/>
         </w:rPr>
       </w:pPr>
-      <w:hyperlink w:anchor="_Toc243219232" w:history="1">
+      <w:hyperlink w:anchor="_Toc243258034" w:history="1">
         <w:r>
           <w:rPr>
             <w:rStyle w:val="Hyperlink"/>
@@ -1431,7 +1431,7 @@
           <w:rPr>
             <w:webHidden/>
           </w:rPr>
-          <w:instrText xml:space="preserve"> PAGEREF _Toc243219232 \h </w:instrText>
+          <w:instrText xml:space="preserve"> PAGEREF _Toc243258034 \h </w:instrText>
         </w:r>
         <w:r>
           <w:rPr>
@@ -1466,7 +1466,7 @@
           <w:lang w:eastAsia="pt-BR"/>
         </w:rPr>
       </w:pPr>
-      <w:hyperlink w:anchor="_Toc243219233" w:history="1">
+      <w:hyperlink w:anchor="_Toc243258035" w:history="1">
         <w:r>
           <w:rPr>
             <w:rStyle w:val="Hyperlink"/>
@@ -1489,7 +1489,7 @@
           <w:rPr>
             <w:webHidden/>
           </w:rPr>
-          <w:instrText xml:space="preserve"> PAGEREF _Toc243219233 \h </w:instrText>
+          <w:instrText xml:space="preserve"> PAGEREF _Toc243258035 \h </w:instrText>
         </w:r>
         <w:r>
           <w:rPr>
@@ -1526,7 +1526,7 @@
           <w:lang w:eastAsia="pt-BR"/>
         </w:rPr>
       </w:pPr>
-      <w:hyperlink w:anchor="_Toc243219234" w:history="1">
+      <w:hyperlink w:anchor="_Toc243258036" w:history="1">
         <w:r>
           <w:rPr>
             <w:rStyle w:val="Hyperlink"/>
@@ -1549,7 +1549,7 @@
           <w:rPr>
             <w:webHidden/>
           </w:rPr>
-          <w:instrText xml:space="preserve"> PAGEREF _Toc243219234 \h </w:instrText>
+          <w:instrText xml:space="preserve"> PAGEREF _Toc243258036 \h </w:instrText>
         </w:r>
         <w:r>
           <w:rPr>
@@ -1584,7 +1584,7 @@
           <w:lang w:eastAsia="pt-BR"/>
         </w:rPr>
       </w:pPr>
-      <w:hyperlink w:anchor="_Toc243219235" w:history="1">
+      <w:hyperlink w:anchor="_Toc243258037" w:history="1">
         <w:r>
           <w:rPr>
             <w:rStyle w:val="Hyperlink"/>
@@ -1607,7 +1607,7 @@
           <w:rPr>
             <w:webHidden/>
           </w:rPr>
-          <w:instrText xml:space="preserve"> PAGEREF _Toc243219235 \h </w:instrText>
+          <w:instrText xml:space="preserve"> PAGEREF _Toc243258037 \h </w:instrText>
         </w:r>
         <w:r>
           <w:rPr>
@@ -1642,7 +1642,7 @@
           <w:lang w:eastAsia="pt-BR"/>
         </w:rPr>
       </w:pPr>
-      <w:hyperlink w:anchor="_Toc243219236" w:history="1">
+      <w:hyperlink w:anchor="_Toc243258038" w:history="1">
         <w:r>
           <w:rPr>
             <w:rStyle w:val="Hyperlink"/>
@@ -1665,7 +1665,7 @@
           <w:rPr>
             <w:webHidden/>
           </w:rPr>
-          <w:instrText xml:space="preserve"> PAGEREF _Toc243219236 \h </w:instrText>
+          <w:instrText xml:space="preserve"> PAGEREF _Toc243258038 \h </w:instrText>
         </w:r>
         <w:r>
           <w:rPr>
@@ -1700,7 +1700,7 @@
           <w:lang w:eastAsia="pt-BR"/>
         </w:rPr>
       </w:pPr>
-      <w:hyperlink w:anchor="_Toc243219237" w:history="1">
+      <w:hyperlink w:anchor="_Toc243258039" w:history="1">
         <w:r>
           <w:rPr>
             <w:rStyle w:val="Hyperlink"/>
@@ -1723,7 +1723,7 @@
           <w:rPr>
             <w:webHidden/>
           </w:rPr>
-          <w:instrText xml:space="preserve"> PAGEREF _Toc243219237 \h </w:instrText>
+          <w:instrText xml:space="preserve"> PAGEREF _Toc243258039 \h </w:instrText>
         </w:r>
         <w:r>
           <w:rPr>
@@ -1758,7 +1758,7 @@
           <w:lang w:eastAsia="pt-BR"/>
         </w:rPr>
       </w:pPr>
-      <w:hyperlink w:anchor="_Toc243219238" w:history="1">
+      <w:hyperlink w:anchor="_Toc243258040" w:history="1">
         <w:r>
           <w:rPr>
             <w:rStyle w:val="Hyperlink"/>
@@ -1781,7 +1781,7 @@
           <w:rPr>
             <w:webHidden/>
           </w:rPr>
-          <w:instrText xml:space="preserve"> PAGEREF _Toc243219238 \h </w:instrText>
+          <w:instrText xml:space="preserve"> PAGEREF _Toc243258040 \h </w:instrText>
         </w:r>
         <w:r>
           <w:rPr>
@@ -1818,7 +1818,7 @@
           <w:lang w:eastAsia="pt-BR"/>
         </w:rPr>
       </w:pPr>
-      <w:hyperlink w:anchor="_Toc243219239" w:history="1">
+      <w:hyperlink w:anchor="_Toc243258041" w:history="1">
         <w:r>
           <w:rPr>
             <w:rStyle w:val="Hyperlink"/>
@@ -1841,7 +1841,7 @@
           <w:rPr>
             <w:webHidden/>
           </w:rPr>
-          <w:instrText xml:space="preserve"> PAGEREF _Toc243219239 \h </w:instrText>
+          <w:instrText xml:space="preserve"> PAGEREF _Toc243258041 \h </w:instrText>
         </w:r>
         <w:r>
           <w:rPr>
@@ -1876,7 +1876,7 @@
           <w:lang w:eastAsia="pt-BR"/>
         </w:rPr>
       </w:pPr>
-      <w:hyperlink w:anchor="_Toc243219240" w:history="1">
+      <w:hyperlink w:anchor="_Toc243258042" w:history="1">
         <w:r>
           <w:rPr>
             <w:rStyle w:val="Hyperlink"/>
@@ -1899,7 +1899,7 @@
           <w:rPr>
             <w:webHidden/>
           </w:rPr>
-          <w:instrText xml:space="preserve"> PAGEREF _Toc243219240 \h </w:instrText>
+          <w:instrText xml:space="preserve"> PAGEREF _Toc243258042 \h </w:instrText>
         </w:r>
         <w:r>
           <w:rPr>
@@ -1934,7 +1934,7 @@
           <w:lang w:eastAsia="pt-BR"/>
         </w:rPr>
       </w:pPr>
-      <w:hyperlink w:anchor="_Toc243219241" w:history="1">
+      <w:hyperlink w:anchor="_Toc243258043" w:history="1">
         <w:r>
           <w:rPr>
             <w:rStyle w:val="Hyperlink"/>
@@ -1957,7 +1957,7 @@
           <w:rPr>
             <w:webHidden/>
           </w:rPr>
-          <w:instrText xml:space="preserve"> PAGEREF _Toc243219241 \h </w:instrText>
+          <w:instrText xml:space="preserve"> PAGEREF _Toc243258043 \h </w:instrText>
         </w:r>
         <w:r>
           <w:rPr>
@@ -1992,7 +1992,7 @@
           <w:lang w:eastAsia="pt-BR"/>
         </w:rPr>
       </w:pPr>
-      <w:hyperlink w:anchor="_Toc243219242" w:history="1">
+      <w:hyperlink w:anchor="_Toc243258044" w:history="1">
         <w:r>
           <w:rPr>
             <w:rStyle w:val="Hyperlink"/>
@@ -2015,7 +2015,7 @@
           <w:rPr>
             <w:webHidden/>
           </w:rPr>
-          <w:instrText xml:space="preserve"> PAGEREF _Toc243219242 \h </w:instrText>
+          <w:instrText xml:space="preserve"> PAGEREF _Toc243258044 \h </w:instrText>
         </w:r>
         <w:r>
           <w:rPr>
@@ -2050,7 +2050,7 @@
           <w:lang w:eastAsia="pt-BR"/>
         </w:rPr>
       </w:pPr>
-      <w:hyperlink w:anchor="_Toc243219243" w:history="1">
+      <w:hyperlink w:anchor="_Toc243258045" w:history="1">
         <w:r>
           <w:rPr>
             <w:rStyle w:val="Hyperlink"/>
@@ -2073,7 +2073,7 @@
           <w:rPr>
             <w:webHidden/>
           </w:rPr>
-          <w:instrText xml:space="preserve"> PAGEREF _Toc243219243 \h </w:instrText>
+          <w:instrText xml:space="preserve"> PAGEREF _Toc243258045 \h </w:instrText>
         </w:r>
         <w:r>
           <w:rPr>
@@ -2110,7 +2110,7 @@
           <w:lang w:eastAsia="pt-BR"/>
         </w:rPr>
       </w:pPr>
-      <w:hyperlink w:anchor="_Toc243219244" w:history="1">
+      <w:hyperlink w:anchor="_Toc243258046" w:history="1">
         <w:r>
           <w:rPr>
             <w:rStyle w:val="Hyperlink"/>
@@ -2133,7 +2133,7 @@
           <w:rPr>
             <w:webHidden/>
           </w:rPr>
-          <w:instrText xml:space="preserve"> PAGEREF _Toc243219244 \h </w:instrText>
+          <w:instrText xml:space="preserve"> PAGEREF _Toc243258046 \h </w:instrText>
         </w:r>
         <w:r>
           <w:rPr>
@@ -2168,7 +2168,7 @@
           <w:lang w:eastAsia="pt-BR"/>
         </w:rPr>
       </w:pPr>
-      <w:hyperlink w:anchor="_Toc243219245" w:history="1">
+      <w:hyperlink w:anchor="_Toc243258047" w:history="1">
         <w:r>
           <w:rPr>
             <w:rStyle w:val="Hyperlink"/>
@@ -2191,7 +2191,7 @@
           <w:rPr>
             <w:webHidden/>
           </w:rPr>
-          <w:instrText xml:space="preserve"> PAGEREF _Toc243219245 \h </w:instrText>
+          <w:instrText xml:space="preserve"> PAGEREF _Toc243258047 \h </w:instrText>
         </w:r>
         <w:r>
           <w:rPr>
@@ -2226,7 +2226,7 @@
           <w:lang w:eastAsia="pt-BR"/>
         </w:rPr>
       </w:pPr>
-      <w:hyperlink w:anchor="_Toc243219246" w:history="1">
+      <w:hyperlink w:anchor="_Toc243258048" w:history="1">
         <w:r>
           <w:rPr>
             <w:rStyle w:val="Hyperlink"/>
@@ -2249,7 +2249,7 @@
           <w:rPr>
             <w:webHidden/>
           </w:rPr>
-          <w:instrText xml:space="preserve"> PAGEREF _Toc243219246 \h </w:instrText>
+          <w:instrText xml:space="preserve"> PAGEREF _Toc243258048 \h </w:instrText>
         </w:r>
         <w:r>
           <w:rPr>
@@ -2284,7 +2284,7 @@
           <w:lang w:eastAsia="pt-BR"/>
         </w:rPr>
       </w:pPr>
-      <w:hyperlink w:anchor="_Toc243219247" w:history="1">
+      <w:hyperlink w:anchor="_Toc243258049" w:history="1">
         <w:r>
           <w:rPr>
             <w:rStyle w:val="Hyperlink"/>
@@ -2307,7 +2307,7 @@
           <w:rPr>
             <w:webHidden/>
           </w:rPr>
-          <w:instrText xml:space="preserve"> PAGEREF _Toc243219247 \h </w:instrText>
+          <w:instrText xml:space="preserve"> PAGEREF _Toc243258049 \h </w:instrText>
         </w:r>
         <w:r>
           <w:rPr>
@@ -2342,7 +2342,7 @@
           <w:lang w:eastAsia="pt-BR"/>
         </w:rPr>
       </w:pPr>
-      <w:hyperlink w:anchor="_Toc243219248" w:history="1">
+      <w:hyperlink w:anchor="_Toc243258050" w:history="1">
         <w:r>
           <w:rPr>
             <w:rStyle w:val="Hyperlink"/>
@@ -2365,7 +2365,7 @@
           <w:rPr>
             <w:webHidden/>
           </w:rPr>
-          <w:instrText xml:space="preserve"> PAGEREF _Toc243219248 \h </w:instrText>
+          <w:instrText xml:space="preserve"> PAGEREF _Toc243258050 \h </w:instrText>
         </w:r>
         <w:r>
           <w:rPr>
@@ -2402,7 +2402,7 @@
           <w:lang w:eastAsia="pt-BR"/>
         </w:rPr>
       </w:pPr>
-      <w:hyperlink w:anchor="_Toc243219249" w:history="1">
+      <w:hyperlink w:anchor="_Toc243258051" w:history="1">
         <w:r>
           <w:rPr>
             <w:rStyle w:val="Hyperlink"/>
@@ -2425,7 +2425,7 @@
           <w:rPr>
             <w:webHidden/>
           </w:rPr>
-          <w:instrText xml:space="preserve"> PAGEREF _Toc243219249 \h </w:instrText>
+          <w:instrText xml:space="preserve"> PAGEREF _Toc243258051 \h </w:instrText>
         </w:r>
         <w:r>
           <w:rPr>
@@ -2462,7 +2462,7 @@
           <w:lang w:eastAsia="pt-BR"/>
         </w:rPr>
       </w:pPr>
-      <w:hyperlink w:anchor="_Toc243219250" w:history="1">
+      <w:hyperlink w:anchor="_Toc243258052" w:history="1">
         <w:r>
           <w:rPr>
             <w:rStyle w:val="Hyperlink"/>
@@ -2485,7 +2485,7 @@
           <w:rPr>
             <w:webHidden/>
           </w:rPr>
-          <w:instrText xml:space="preserve"> PAGEREF _Toc243219250 \h </w:instrText>
+          <w:instrText xml:space="preserve"> PAGEREF _Toc243258052 \h </w:instrText>
         </w:r>
         <w:r>
           <w:rPr>
@@ -2534,7 +2534,7 @@
       <w:pPr>
         <w:pStyle w:val="Ttulo1"/>
       </w:pPr>
-      <w:bookmarkStart w:id="0" w:name="_Toc243219212"/>
+      <w:bookmarkStart w:id="0" w:name="_Toc243258014"/>
       <w:r>
         <w:lastRenderedPageBreak/>
         <w:t>INTRODUÇÃO</w:t>
@@ -2580,7 +2580,7 @@
       <w:pPr>
         <w:pStyle w:val="Ttulo2"/>
       </w:pPr>
-      <w:bookmarkStart w:id="1" w:name="_Toc243219213"/>
+      <w:bookmarkStart w:id="1" w:name="_Toc243258015"/>
       <w:r>
         <w:t>Convenções Adotadas</w:t>
       </w:r>
@@ -2648,8 +2648,9 @@
       <w:pPr>
         <w:pStyle w:val="Ttulo1"/>
       </w:pPr>
-      <w:bookmarkStart w:id="2" w:name="_Toc243219214"/>
-      <w:r>
+      <w:bookmarkStart w:id="2" w:name="_Toc243258016"/>
+      <w:r>
+        <w:lastRenderedPageBreak/>
         <w:t>FUNDAMENTOS</w:t>
       </w:r>
       <w:bookmarkEnd w:id="2"/>
@@ -2658,7 +2659,7 @@
       <w:pPr>
         <w:pStyle w:val="Ttulo2"/>
       </w:pPr>
-      <w:bookmarkStart w:id="3" w:name="_Toc243219215"/>
+      <w:bookmarkStart w:id="3" w:name="_Toc243258017"/>
       <w:r>
         <w:t>Desenvolvimento Assistido por IA</w:t>
       </w:r>
@@ -2713,7 +2714,7 @@
       <w:pPr>
         <w:pStyle w:val="Ttulo2"/>
       </w:pPr>
-      <w:bookmarkStart w:id="4" w:name="_Toc243219216"/>
+      <w:bookmarkStart w:id="4" w:name="_Toc243258018"/>
       <w:r>
         <w:t>Interpretable Context Methodology</w:t>
       </w:r>
@@ -3057,6 +3058,7 @@
               <w:pStyle w:val="TextodeTabela"/>
             </w:pPr>
             <w:r>
+              <w:lastRenderedPageBreak/>
               <w:t>3 – Referência</w:t>
             </w:r>
           </w:p>
@@ -3233,7 +3235,7 @@
       <w:pPr>
         <w:pStyle w:val="Ttulo2"/>
       </w:pPr>
-      <w:bookmarkStart w:id="5" w:name="_Toc243219217"/>
+      <w:bookmarkStart w:id="5" w:name="_Toc243258019"/>
       <w:r>
         <w:t>Economia de Contexto</w:t>
       </w:r>
@@ -3281,7 +3283,7 @@
       <w:pPr>
         <w:pStyle w:val="Ttulo2"/>
       </w:pPr>
-      <w:bookmarkStart w:id="6" w:name="_Toc243219218"/>
+      <w:bookmarkStart w:id="6" w:name="_Toc243258020"/>
       <w:r>
         <w:t>Adaptação ao Desenvolvimento de Software</w:t>
       </w:r>
@@ -3292,7 +3294,11 @@
         <w:pStyle w:val="Texto"/>
       </w:pPr>
       <w:r>
-        <w:t xml:space="preserve">A ICM foi concebida para fluxos sequenciais revisados por pessoas, como a produção de conteúdo. No desenvolvimento do Glow, a unidade de trabalho é a tarefa, e toda tarefa percorre as mesmas quatro etapas: planejar, construir, entregar e encerrar. Os contratos dessas etapas ficam em </w:t>
+        <w:t xml:space="preserve">A ICM foi concebida para fluxos sequenciais revisados por pessoas, como a produção de conteúdo. No desenvolvimento do Glow, a unidade de trabalho é a tarefa, e toda tarefa percorre as mesmas quatro etapas: planejar, construir, entregar e </w:t>
+      </w:r>
+      <w:r>
+        <w:lastRenderedPageBreak/>
+        <w:t xml:space="preserve">encerrar. Os contratos dessas etapas ficam em </w:t>
       </w:r>
       <w:r>
         <w:rPr>
@@ -3351,8 +3357,9 @@
       <w:pPr>
         <w:pStyle w:val="Ttulo1"/>
       </w:pPr>
-      <w:bookmarkStart w:id="7" w:name="_Toc243219219"/>
-      <w:r>
+      <w:bookmarkStart w:id="7" w:name="_Toc243258021"/>
+      <w:r>
+        <w:lastRenderedPageBreak/>
         <w:t>ARQUITETURA DE DIRETÓRIOS</w:t>
       </w:r>
       <w:bookmarkEnd w:id="7"/>
@@ -3545,6 +3552,15 @@
       </w:pPr>
       <w:r>
         <w:t>├── documentos-formais/    os três documentos formais (.docx)</w:t>
+      </w:r>
+    </w:p>
+    <w:p>
+      <w:pPr>
+        <w:pStyle w:val="Cdigo"/>
+        <w:keepNext/>
+      </w:pPr>
+      <w:r>
+        <w:t>├── wireframes/            telas de referência das páginas, em PDF</w:t>
       </w:r>
     </w:p>
     <w:p>
@@ -4064,6 +4080,7 @@
                 <w:sz w:val="18"/>
                 <w:szCs w:val="18"/>
               </w:rPr>
+              <w:lastRenderedPageBreak/>
               <w:t>guia/mapa.md</w:t>
             </w:r>
             <w:r>
@@ -4315,7 +4332,7 @@
       <w:pPr>
         <w:pStyle w:val="Ttulo2"/>
       </w:pPr>
-      <w:bookmarkStart w:id="8" w:name="_Toc243219220"/>
+      <w:bookmarkStart w:id="8" w:name="_Toc243258022"/>
       <w:r>
         <w:t>Identidade: AGENTS.md e CLAUDE.md</w:t>
       </w:r>
@@ -4495,6 +4512,7 @@
         <w:keepNext/>
       </w:pPr>
       <w:r>
+        <w:lastRenderedPageBreak/>
         <w:t>Um exemplo resumido do arquivo é apresentado a seguir.</w:t>
       </w:r>
     </w:p>
@@ -4750,7 +4768,7 @@
       <w:pPr>
         <w:pStyle w:val="Ttulo2"/>
       </w:pPr>
-      <w:bookmarkStart w:id="9" w:name="_Toc243219221"/>
+      <w:bookmarkStart w:id="9" w:name="_Toc243258023"/>
       <w:r>
         <w:t>Roteamento: guia/</w:t>
       </w:r>
@@ -5185,6 +5203,7 @@
               <w:pStyle w:val="TextodeTabela"/>
             </w:pPr>
             <w:r>
+              <w:lastRenderedPageBreak/>
               <w:t>Alteração do banco</w:t>
             </w:r>
           </w:p>
@@ -5484,7 +5503,7 @@
       <w:pPr>
         <w:pStyle w:val="Ttulo2"/>
       </w:pPr>
-      <w:bookmarkStart w:id="10" w:name="_Toc243219222"/>
+      <w:bookmarkStart w:id="10" w:name="_Toc243258024"/>
       <w:r>
         <w:t>Contratos das Etapas: workflows/</w:t>
       </w:r>
@@ -5578,6 +5597,7 @@
           <w:i/>
           <w:iCs/>
         </w:rPr>
+        <w:lastRenderedPageBreak/>
         <w:t>migration</w:t>
       </w:r>
       <w:r>
@@ -5754,7 +5774,7 @@
       <w:pPr>
         <w:pStyle w:val="Ttulo2"/>
       </w:pPr>
-      <w:bookmarkStart w:id="11" w:name="_Toc243219223"/>
+      <w:bookmarkStart w:id="11" w:name="_Toc243258025"/>
       <w:r>
         <w:t>Referências: docs/</w:t>
       </w:r>
@@ -6093,6 +6113,7 @@
         <w:spacing w:before="240"/>
       </w:pPr>
       <w:r>
+        <w:lastRenderedPageBreak/>
         <w:t xml:space="preserve">Os documentos em Word continuam sendo a referência formal e ficam versionados em </w:t>
       </w:r>
       <w:r>
@@ -6153,7 +6174,7 @@
       <w:pPr>
         <w:pStyle w:val="Ttulo2"/>
       </w:pPr>
-      <w:bookmarkStart w:id="12" w:name="_Toc243219224"/>
+      <w:bookmarkStart w:id="12" w:name="_Toc243258026"/>
       <w:r>
         <w:t>Memória das Tarefas: memoria/</w:t>
       </w:r>
@@ -6620,6 +6641,7 @@
                 <w:sz w:val="18"/>
                 <w:szCs w:val="18"/>
               </w:rPr>
+              <w:lastRenderedPageBreak/>
               <w:t>em_execucao</w:t>
             </w:r>
           </w:p>
@@ -6797,7 +6819,7 @@
       <w:pPr>
         <w:pStyle w:val="Ttulo2"/>
       </w:pPr>
-      <w:bookmarkStart w:id="13" w:name="_Toc243219225"/>
+      <w:bookmarkStart w:id="13" w:name="_Toc243258027"/>
       <w:r>
         <w:t>Configuração e Apoio</w:t>
       </w:r>
@@ -7023,6 +7045,35 @@
         <w:rPr>
           <w:rFonts w:ascii="Courier New" w:hAnsi="Courier New" w:cs="Courier New"/>
           <w:sz w:val="22"/>
+        </w:rPr>
+        <w:t>wireframes/</w:t>
+      </w:r>
+      <w:r>
+        <w:t xml:space="preserve">: telas de outro sistema, em PDF, como referência de esqueleto e componentes das páginas; o que cada página tem vem de </w:t>
+      </w:r>
+      <w:r>
+        <w:rPr>
+          <w:rFonts w:ascii="Courier New" w:hAnsi="Courier New" w:cs="Courier New"/>
+          <w:sz w:val="22"/>
+        </w:rPr>
+        <w:t>docs/</w:t>
+      </w:r>
+      <w:r>
+        <w:t xml:space="preserve"> e as cores, do tema, e a pasta fica fora da imagem do contêiner;</w:t>
+      </w:r>
+    </w:p>
+    <w:p>
+      <w:pPr>
+        <w:pStyle w:val="Texto"/>
+        <w:numPr>
+          <w:ilvl w:val="0"/>
+          <w:numId w:val="7"/>
+        </w:numPr>
+      </w:pPr>
+      <w:r>
+        <w:rPr>
+          <w:rFonts w:ascii="Courier New" w:hAnsi="Courier New" w:cs="Courier New"/>
+          <w:sz w:val="22"/>
           <w:szCs w:val="22"/>
         </w:rPr>
         <w:t>.github/</w:t>
@@ -7065,8 +7116,9 @@
       <w:pPr>
         <w:pStyle w:val="Ttulo1"/>
       </w:pPr>
-      <w:bookmarkStart w:id="14" w:name="_Toc243219226"/>
-      <w:r>
+      <w:bookmarkStart w:id="14" w:name="_Toc243258028"/>
+      <w:r>
+        <w:lastRenderedPageBreak/>
         <w:t>CICLO DE DESENVOLVIMENTO</w:t>
       </w:r>
       <w:bookmarkEnd w:id="14"/>
@@ -7666,6 +7718,7 @@
               <w:pStyle w:val="TextodeTabela"/>
             </w:pPr>
             <w:r>
+              <w:lastRenderedPageBreak/>
               <w:t>04 Encerrar</w:t>
             </w:r>
           </w:p>
@@ -7775,7 +7828,7 @@
       <w:pPr>
         <w:pStyle w:val="Ttulo2"/>
       </w:pPr>
-      <w:bookmarkStart w:id="15" w:name="_Toc243219227"/>
+      <w:bookmarkStart w:id="15" w:name="_Toc243258029"/>
       <w:r>
         <w:t>Pontos de Controle Humano</w:t>
       </w:r>
@@ -7863,7 +7916,7 @@
       <w:pPr>
         <w:pStyle w:val="Ttulo2"/>
       </w:pPr>
-      <w:bookmarkStart w:id="16" w:name="_Toc243219228"/>
+      <w:bookmarkStart w:id="16" w:name="_Toc243258030"/>
       <w:r>
         <w:t>Variações por Tipo de Tarefa</w:t>
       </w:r>
@@ -7944,6 +7997,7 @@
         </w:numPr>
       </w:pPr>
       <w:r>
+        <w:lastRenderedPageBreak/>
         <w:t>investigação (</w:t>
       </w:r>
       <w:r>
@@ -8007,6 +8061,12 @@
         <w:t>pull request</w:t>
       </w:r>
       <w:r>
+        <w:rPr>
+          <w:iCs/>
+        </w:rPr>
+        <w:t>, é conferida num banco local descartável</w:t>
+      </w:r>
+      <w:r>
         <w:t xml:space="preserve"> e é aplicada pelo integrante designado depois da aprovação e antes da incorporação, sempre compatível com a versão em produção (Documentação de Arquitetura, seção 8.4);</w:t>
       </w:r>
     </w:p>
@@ -8026,8 +8086,9 @@
       <w:pPr>
         <w:pStyle w:val="Ttulo1"/>
       </w:pPr>
-      <w:bookmarkStart w:id="17" w:name="_Toc243219229"/>
-      <w:r>
+      <w:bookmarkStart w:id="17" w:name="_Toc243258031"/>
+      <w:r>
+        <w:lastRenderedPageBreak/>
         <w:t>REGRAS DA IA</w:t>
       </w:r>
       <w:bookmarkEnd w:id="17"/>
@@ -8055,7 +8116,7 @@
       <w:pPr>
         <w:pStyle w:val="Ttulo2"/>
       </w:pPr>
-      <w:bookmarkStart w:id="18" w:name="_Toc243219230"/>
+      <w:bookmarkStart w:id="18" w:name="_Toc243258032"/>
       <w:r>
         <w:t>Limites</w:t>
       </w:r>
@@ -8146,7 +8207,60 @@
         <w:t>migrations</w:t>
       </w:r>
       <w:r>
-        <w:t xml:space="preserve"> no banco ou publica a aplicação;</w:t>
+        <w:t xml:space="preserve"> no banco</w:t>
+      </w:r>
+      <w:r>
+        <w:t xml:space="preserve">, vincula o projeto do Supabase ou usa as opções </w:t>
+      </w:r>
+      <w:r>
+        <w:rPr>
+          <w:rFonts w:ascii="Courier New" w:hAnsi="Courier New" w:cs="Courier New"/>
+          <w:sz w:val="22"/>
+        </w:rPr>
+        <w:noBreakHyphen/>
+      </w:r>
+      <w:r>
+        <w:rPr>
+          <w:rFonts w:ascii="Courier New" w:hAnsi="Courier New" w:cs="Courier New"/>
+          <w:sz w:val="22"/>
+        </w:rPr>
+        <w:noBreakHyphen/>
+        <w:t>linked</w:t>
+      </w:r>
+      <w:r>
+        <w:t xml:space="preserve"> e </w:t>
+      </w:r>
+      <w:r>
+        <w:rPr>
+          <w:rFonts w:ascii="Courier New" w:hAnsi="Courier New" w:cs="Courier New"/>
+          <w:sz w:val="22"/>
+        </w:rPr>
+        <w:noBreakHyphen/>
+      </w:r>
+      <w:r>
+        <w:rPr>
+          <w:rFonts w:ascii="Courier New" w:hAnsi="Courier New" w:cs="Courier New"/>
+          <w:sz w:val="22"/>
+        </w:rPr>
+        <w:noBreakHyphen/>
+        <w:t>db</w:t>
+      </w:r>
+      <w:r>
+        <w:rPr>
+          <w:rFonts w:ascii="Courier New" w:hAnsi="Courier New" w:cs="Courier New"/>
+          <w:sz w:val="22"/>
+        </w:rPr>
+        <w:noBreakHyphen/>
+        <w:t>url</w:t>
+      </w:r>
+      <w:r>
+        <w:t xml:space="preserve"> da CLI, que apontam para o projeto real,</w:t>
+      </w:r>
+      <w:r>
+        <w:t xml:space="preserve"> ou publica a aplicação;</w:t>
+      </w:r>
+      <w:r>
+        <w:t xml:space="preserve"> o único banco que o agente acessa é o local, descartável;</w:t>
       </w:r>
     </w:p>
     <w:p>
@@ -8267,8 +8381,9 @@
       <w:pPr>
         <w:pStyle w:val="Ttulo2"/>
       </w:pPr>
-      <w:bookmarkStart w:id="19" w:name="_Toc243219231"/>
-      <w:r>
+      <w:bookmarkStart w:id="19" w:name="_Toc243258033"/>
+      <w:r>
+        <w:lastRenderedPageBreak/>
         <w:t>Quando Parar e Perguntar</w:t>
       </w:r>
       <w:bookmarkEnd w:id="19"/>
@@ -8409,7 +8524,7 @@
       <w:pPr>
         <w:pStyle w:val="Ttulo2"/>
       </w:pPr>
-      <w:bookmarkStart w:id="20" w:name="_Toc243219232"/>
+      <w:bookmarkStart w:id="20" w:name="_Toc243258034"/>
       <w:r>
         <w:t>Como Programar</w:t>
       </w:r>
@@ -8523,6 +8638,7 @@
         </w:numPr>
       </w:pPr>
       <w:r>
+        <w:lastRenderedPageBreak/>
         <w:t xml:space="preserve">responder os erros pelo tratamento único, com as mensagens do catálogo de </w:t>
       </w:r>
       <w:r>
@@ -8732,7 +8848,7 @@
       <w:pPr>
         <w:pStyle w:val="Ttulo2"/>
       </w:pPr>
-      <w:bookmarkStart w:id="21" w:name="_Toc243219233"/>
+      <w:bookmarkStart w:id="21" w:name="_Toc243258035"/>
       <w:r>
         <w:t>Uso do Contexto</w:t>
       </w:r>
@@ -8881,6 +8997,7 @@
         </w:numPr>
       </w:pPr>
       <w:r>
+        <w:lastRenderedPageBreak/>
         <w:t>quando uma correção do desenvolvedor se repete, propõe a atualização do padrão ou da regra correspondente, para que ela deixe de depender da memória de alguém.</w:t>
       </w:r>
     </w:p>
@@ -8888,8 +9005,9 @@
       <w:pPr>
         <w:pStyle w:val="Ttulo1"/>
       </w:pPr>
-      <w:bookmarkStart w:id="22" w:name="_Toc243219234"/>
-      <w:r>
+      <w:bookmarkStart w:id="22" w:name="_Toc243258036"/>
+      <w:r>
+        <w:lastRenderedPageBreak/>
         <w:t>DIRETRIZES DE SEGURANÇA</w:t>
       </w:r>
       <w:bookmarkEnd w:id="22"/>
@@ -8906,7 +9024,7 @@
       <w:pPr>
         <w:pStyle w:val="Ttulo2"/>
       </w:pPr>
-      <w:bookmarkStart w:id="23" w:name="_Toc243219235"/>
+      <w:bookmarkStart w:id="23" w:name="_Toc243258037"/>
       <w:r>
         <w:t>Dados e Segredos</w:t>
       </w:r>
@@ -9051,7 +9169,7 @@
       <w:pPr>
         <w:pStyle w:val="Ttulo2"/>
       </w:pPr>
-      <w:bookmarkStart w:id="24" w:name="_Toc243219236"/>
+      <w:bookmarkStart w:id="24" w:name="_Toc243258038"/>
       <w:r>
         <w:t>Permissões do Agente</w:t>
       </w:r>
@@ -9085,7 +9203,11 @@
         <w:t>.env.example</w:t>
       </w:r>
       <w:r>
-        <w:t xml:space="preserve">, de exibir as variáveis pelo Docker, de aplicar </w:t>
+        <w:t xml:space="preserve">, de exibir as </w:t>
+      </w:r>
+      <w:r>
+        <w:lastRenderedPageBreak/>
+        <w:t xml:space="preserve">variáveis pelo Docker, de aplicar </w:t>
       </w:r>
       <w:r>
         <w:rPr>
@@ -9169,6 +9291,24 @@
         <w:keepNext/>
       </w:pPr>
       <w:r>
+        <w:t xml:space="preserve">      "Bash(npx supabase link:*)",</w:t>
+      </w:r>
+    </w:p>
+    <w:p>
+      <w:pPr>
+        <w:pStyle w:val="Cdigo"/>
+        <w:keepNext/>
+      </w:pPr>
+      <w:r>
+        <w:t xml:space="preserve">      "Bash(npx supabase db reset --linked:*)",</w:t>
+      </w:r>
+    </w:p>
+    <w:p>
+      <w:pPr>
+        <w:pStyle w:val="Cdigo"/>
+        <w:keepNext/>
+      </w:pPr>
+      <w:r>
         <w:t xml:space="preserve">      "Bash(gh pr merge:*)",</w:t>
       </w:r>
     </w:p>
@@ -9313,7 +9453,7 @@
       <w:pPr>
         <w:pStyle w:val="Ttulo2"/>
       </w:pPr>
-      <w:bookmarkStart w:id="25" w:name="_Toc243219237"/>
+      <w:bookmarkStart w:id="25" w:name="_Toc243258039"/>
       <w:r>
         <w:t>Revisão de Segurança do Código Gerado</w:t>
       </w:r>
@@ -9640,6 +9780,7 @@
               <w:pStyle w:val="TextodeTabela"/>
             </w:pPr>
             <w:r>
+              <w:lastRenderedPageBreak/>
               <w:t xml:space="preserve">Nenhuma senha, </w:t>
             </w:r>
             <w:r>
@@ -9725,7 +9866,7 @@
       <w:pPr>
         <w:pStyle w:val="Ttulo2"/>
       </w:pPr>
-      <w:bookmarkStart w:id="26" w:name="_Toc243219238"/>
+      <w:bookmarkStart w:id="26" w:name="_Toc243258040"/>
       <w:r>
         <w:t>Dependências e Conteúdo Externo</w:t>
       </w:r>
@@ -9813,8 +9954,9 @@
       <w:pPr>
         <w:pStyle w:val="Ttulo1"/>
       </w:pPr>
-      <w:bookmarkStart w:id="27" w:name="_Toc243219239"/>
-      <w:r>
+      <w:bookmarkStart w:id="27" w:name="_Toc243258041"/>
+      <w:r>
+        <w:lastRenderedPageBreak/>
         <w:t>WORKFLOW DA EQUIPE</w:t>
       </w:r>
       <w:bookmarkEnd w:id="27"/>
@@ -9823,7 +9965,7 @@
       <w:pPr>
         <w:pStyle w:val="Ttulo2"/>
       </w:pPr>
-      <w:bookmarkStart w:id="28" w:name="_Toc243219240"/>
+      <w:bookmarkStart w:id="28" w:name="_Toc243258042"/>
       <w:r>
         <w:t>Áreas e Divisão das Tarefas</w:t>
       </w:r>
@@ -10345,7 +10487,7 @@
       <w:pPr>
         <w:pStyle w:val="Ttulo2"/>
       </w:pPr>
-      <w:bookmarkStart w:id="29" w:name="_Toc243219241"/>
+      <w:bookmarkStart w:id="29" w:name="_Toc243258043"/>
       <w:r>
         <w:t>Gestão das Tarefas</w:t>
       </w:r>
@@ -10420,7 +10562,11 @@
         <w:t>tipo:documentacao</w:t>
       </w:r>
       <w:r>
-        <w:t xml:space="preserve"> ou </w:t>
+        <w:t xml:space="preserve"> </w:t>
+      </w:r>
+      <w:r>
+        <w:lastRenderedPageBreak/>
+        <w:t xml:space="preserve">ou </w:t>
       </w:r>
       <w:r>
         <w:rPr>
@@ -10550,7 +10696,7 @@
       <w:pPr>
         <w:pStyle w:val="Ttulo2"/>
       </w:pPr>
-      <w:bookmarkStart w:id="30" w:name="_Toc243219242"/>
+      <w:bookmarkStart w:id="30" w:name="_Toc243258044"/>
       <w:r>
         <w:t>Ramificações, Commits e Conflitos</w:t>
       </w:r>
@@ -10846,7 +10992,11 @@
         <w:t>commit</w:t>
       </w:r>
       <w:r>
-        <w:t xml:space="preserve">. As ramificações têm vida curta: cada tarefa é dimensionada para ser concluída em um ou dois dias de trabalho, e uma funcionalidade grande é entregue em vários </w:t>
+        <w:t xml:space="preserve">. As ramificações têm vida curta: cada tarefa é dimensionada para ser concluída em um ou dois dias de trabalho, e uma funcionalidade grande é entregue </w:t>
+      </w:r>
+      <w:r>
+        <w:lastRenderedPageBreak/>
+        <w:t xml:space="preserve">em vários </w:t>
       </w:r>
       <w:r>
         <w:rPr>
@@ -10963,7 +11113,7 @@
       <w:pPr>
         <w:pStyle w:val="Ttulo2"/>
       </w:pPr>
-      <w:bookmarkStart w:id="31" w:name="_Toc243219243"/>
+      <w:bookmarkStart w:id="31" w:name="_Toc243258045"/>
       <w:r>
         <w:t>Pull Requests e Revisão</w:t>
       </w:r>
@@ -11120,6 +11270,7 @@
         </w:numPr>
       </w:pPr>
       <w:r>
+        <w:lastRenderedPageBreak/>
         <w:t xml:space="preserve">a incorporação exige CI aprovado, compilação da Vercel concluída, ramificação atualizada com a </w:t>
       </w:r>
       <w:r>
@@ -11203,8 +11354,9 @@
       <w:pPr>
         <w:pStyle w:val="Ttulo1"/>
       </w:pPr>
-      <w:bookmarkStart w:id="32" w:name="_Toc243219244"/>
-      <w:r>
+      <w:bookmarkStart w:id="32" w:name="_Toc243258046"/>
+      <w:r>
+        <w:lastRenderedPageBreak/>
         <w:t>QA (QUALITY ASSURANCE)</w:t>
       </w:r>
       <w:bookmarkEnd w:id="32"/>
@@ -11231,7 +11383,7 @@
       <w:pPr>
         <w:pStyle w:val="Ttulo2"/>
       </w:pPr>
-      <w:bookmarkStart w:id="33" w:name="_Toc243219245"/>
+      <w:bookmarkStart w:id="33" w:name="_Toc243258047"/>
       <w:r>
         <w:t>Testes Automatizados</w:t>
       </w:r>
@@ -11650,6 +11802,7 @@
         <w:keepNext/>
       </w:pPr>
       <w:r>
+        <w:lastRenderedPageBreak/>
         <w:t>Como os testes também são escritos com o auxílio da IA, valem as regras a seguir:</w:t>
       </w:r>
     </w:p>
@@ -11773,7 +11926,7 @@
       <w:pPr>
         <w:pStyle w:val="Ttulo2"/>
       </w:pPr>
-      <w:bookmarkStart w:id="34" w:name="_Toc243219246"/>
+      <w:bookmarkStart w:id="34" w:name="_Toc243258048"/>
       <w:r>
         <w:t>Testes Manuais</w:t>
       </w:r>
@@ -11874,7 +12027,11 @@
         <w:t>next.config.ts</w:t>
       </w:r>
       <w:r>
-        <w:t xml:space="preserve">, as dependências ou a leitura de variáveis de ambiente, a aplicação compilada também é conferida no contêiner, com </w:t>
+        <w:t xml:space="preserve">, as dependências ou a leitura de variáveis de ambiente, a aplicação </w:t>
+      </w:r>
+      <w:r>
+        <w:lastRenderedPageBreak/>
+        <w:t xml:space="preserve">compilada também é conferida no contêiner, com </w:t>
       </w:r>
       <w:r>
         <w:rPr>
@@ -11903,7 +12060,7 @@
       <w:pPr>
         <w:pStyle w:val="Ttulo2"/>
       </w:pPr>
-      <w:bookmarkStart w:id="35" w:name="_Toc243219247"/>
+      <w:bookmarkStart w:id="35" w:name="_Toc243258049"/>
       <w:r>
         <w:t>Critérios de Pronto</w:t>
       </w:r>
@@ -12055,7 +12212,7 @@
       <w:pPr>
         <w:pStyle w:val="Ttulo2"/>
       </w:pPr>
-      <w:bookmarkStart w:id="36" w:name="_Toc243219248"/>
+      <w:bookmarkStart w:id="36" w:name="_Toc243258050"/>
       <w:r>
         <w:t>Registro de Defeitos</w:t>
       </w:r>
@@ -12094,8 +12251,9 @@
       <w:pPr>
         <w:pStyle w:val="Ttulo1"/>
       </w:pPr>
-      <w:bookmarkStart w:id="37" w:name="_Toc243219249"/>
-      <w:r>
+      <w:bookmarkStart w:id="37" w:name="_Toc243258051"/>
+      <w:r>
+        <w:lastRenderedPageBreak/>
         <w:t>FERRAMENTAS</w:t>
       </w:r>
       <w:bookmarkEnd w:id="37"/>
@@ -12453,7 +12611,7 @@
               <w:pStyle w:val="TextodeTabela"/>
             </w:pPr>
             <w:r>
-              <w:t>Supabase CLI e painel</w:t>
+              <w:t>Supabase CLI</w:t>
             </w:r>
           </w:p>
         </w:tc>
@@ -12466,17 +12624,16 @@
               <w:pStyle w:val="TextodeTabela"/>
             </w:pPr>
             <w:r>
-              <w:t xml:space="preserve">Aplicação das </w:t>
+              <w:t xml:space="preserve">Banco local no Docker para conferir as </w:t>
             </w:r>
             <w:r>
               <w:rPr>
                 <w:i/>
-                <w:iCs/>
               </w:rPr>
               <w:t>migrations</w:t>
             </w:r>
             <w:r>
-              <w:t xml:space="preserve"> pelo integrante designado e administração do projeto.</w:t>
+              <w:t xml:space="preserve"> e aplicação delas no projeto pelo integrante designado (Documentação de Arquitetura, seção 8.4); nada é configurado à mão no painel do Supabase.</w:t>
             </w:r>
           </w:p>
         </w:tc>
@@ -12648,8 +12805,9 @@
         </w:numPr>
         <w:jc w:val="center"/>
       </w:pPr>
-      <w:bookmarkStart w:id="38" w:name="_Toc243219250"/>
-      <w:r>
+      <w:bookmarkStart w:id="38" w:name="_Toc243258052"/>
+      <w:r>
+        <w:lastRenderedPageBreak/>
         <w:t>REFERÊNCIAS</w:t>
       </w:r>
       <w:bookmarkEnd w:id="38"/>

</xml_diff>

<commit_message>
docs: update the AI development document after #21 to #37
- 5.3: shadcn/ui on Base UI, with render instead of asChild
- 8.1: what Vitest tests and the tests/ folders
- Quadro 9: new cases and the request handling, API client, page
  protection and formatting rows
- 8.2: screen checks at 360 and 1440 pixels, both themes, Lighthouse

Co-Authored-By: Claude Opus 5.5 <noreply@anthropic.com>
</commit_message>
<xml_diff>
--- a/documentos-formais/DesenvolvimentoComIA.docx
+++ b/documentos-formais/DesenvolvimentoComIA.docx
@@ -240,7 +240,7 @@
       <w:r>
         <w:fldChar w:fldCharType="separate"/>
       </w:r>
-      <w:hyperlink w:anchor="_Toc243258014" w:history="1">
+      <w:hyperlink w:anchor="_Toc243435567" w:history="1">
         <w:r>
           <w:rPr>
             <w:rStyle w:val="Hyperlink"/>
@@ -263,7 +263,7 @@
           <w:rPr>
             <w:webHidden/>
           </w:rPr>
-          <w:instrText xml:space="preserve"> PAGEREF _Toc243258014 \h </w:instrText>
+          <w:instrText xml:space="preserve"> PAGEREF _Toc243435567 \h </w:instrText>
         </w:r>
         <w:r>
           <w:rPr>
@@ -298,7 +298,7 @@
           <w:lang w:eastAsia="pt-BR"/>
         </w:rPr>
       </w:pPr>
-      <w:hyperlink w:anchor="_Toc243258015" w:history="1">
+      <w:hyperlink w:anchor="_Toc243435568" w:history="1">
         <w:r>
           <w:rPr>
             <w:rStyle w:val="Hyperlink"/>
@@ -321,7 +321,7 @@
           <w:rPr>
             <w:webHidden/>
           </w:rPr>
-          <w:instrText xml:space="preserve"> PAGEREF _Toc243258015 \h </w:instrText>
+          <w:instrText xml:space="preserve"> PAGEREF _Toc243435568 \h </w:instrText>
         </w:r>
         <w:r>
           <w:rPr>
@@ -358,7 +358,7 @@
           <w:lang w:eastAsia="pt-BR"/>
         </w:rPr>
       </w:pPr>
-      <w:hyperlink w:anchor="_Toc243258016" w:history="1">
+      <w:hyperlink w:anchor="_Toc243435569" w:history="1">
         <w:r>
           <w:rPr>
             <w:rStyle w:val="Hyperlink"/>
@@ -381,7 +381,7 @@
           <w:rPr>
             <w:webHidden/>
           </w:rPr>
-          <w:instrText xml:space="preserve"> PAGEREF _Toc243258016 \h </w:instrText>
+          <w:instrText xml:space="preserve"> PAGEREF _Toc243435569 \h </w:instrText>
         </w:r>
         <w:r>
           <w:rPr>
@@ -416,7 +416,7 @@
           <w:lang w:eastAsia="pt-BR"/>
         </w:rPr>
       </w:pPr>
-      <w:hyperlink w:anchor="_Toc243258017" w:history="1">
+      <w:hyperlink w:anchor="_Toc243435570" w:history="1">
         <w:r>
           <w:rPr>
             <w:rStyle w:val="Hyperlink"/>
@@ -439,7 +439,7 @@
           <w:rPr>
             <w:webHidden/>
           </w:rPr>
-          <w:instrText xml:space="preserve"> PAGEREF _Toc243258017 \h </w:instrText>
+          <w:instrText xml:space="preserve"> PAGEREF _Toc243435570 \h </w:instrText>
         </w:r>
         <w:r>
           <w:rPr>
@@ -474,7 +474,7 @@
           <w:lang w:eastAsia="pt-BR"/>
         </w:rPr>
       </w:pPr>
-      <w:hyperlink w:anchor="_Toc243258018" w:history="1">
+      <w:hyperlink w:anchor="_Toc243435571" w:history="1">
         <w:r>
           <w:rPr>
             <w:rStyle w:val="Hyperlink"/>
@@ -497,7 +497,7 @@
           <w:rPr>
             <w:webHidden/>
           </w:rPr>
-          <w:instrText xml:space="preserve"> PAGEREF _Toc243258018 \h </w:instrText>
+          <w:instrText xml:space="preserve"> PAGEREF _Toc243435571 \h </w:instrText>
         </w:r>
         <w:r>
           <w:rPr>
@@ -532,7 +532,7 @@
           <w:lang w:eastAsia="pt-BR"/>
         </w:rPr>
       </w:pPr>
-      <w:hyperlink w:anchor="_Toc243258019" w:history="1">
+      <w:hyperlink w:anchor="_Toc243435572" w:history="1">
         <w:r>
           <w:rPr>
             <w:rStyle w:val="Hyperlink"/>
@@ -555,7 +555,7 @@
           <w:rPr>
             <w:webHidden/>
           </w:rPr>
-          <w:instrText xml:space="preserve"> PAGEREF _Toc243258019 \h </w:instrText>
+          <w:instrText xml:space="preserve"> PAGEREF _Toc243435572 \h </w:instrText>
         </w:r>
         <w:r>
           <w:rPr>
@@ -590,7 +590,7 @@
           <w:lang w:eastAsia="pt-BR"/>
         </w:rPr>
       </w:pPr>
-      <w:hyperlink w:anchor="_Toc243258020" w:history="1">
+      <w:hyperlink w:anchor="_Toc243435573" w:history="1">
         <w:r>
           <w:rPr>
             <w:rStyle w:val="Hyperlink"/>
@@ -613,7 +613,7 @@
           <w:rPr>
             <w:webHidden/>
           </w:rPr>
-          <w:instrText xml:space="preserve"> PAGEREF _Toc243258020 \h </w:instrText>
+          <w:instrText xml:space="preserve"> PAGEREF _Toc243435573 \h </w:instrText>
         </w:r>
         <w:r>
           <w:rPr>
@@ -650,7 +650,7 @@
           <w:lang w:eastAsia="pt-BR"/>
         </w:rPr>
       </w:pPr>
-      <w:hyperlink w:anchor="_Toc243258021" w:history="1">
+      <w:hyperlink w:anchor="_Toc243435574" w:history="1">
         <w:r>
           <w:rPr>
             <w:rStyle w:val="Hyperlink"/>
@@ -673,7 +673,7 @@
           <w:rPr>
             <w:webHidden/>
           </w:rPr>
-          <w:instrText xml:space="preserve"> PAGEREF _Toc243258021 \h </w:instrText>
+          <w:instrText xml:space="preserve"> PAGEREF _Toc243435574 \h </w:instrText>
         </w:r>
         <w:r>
           <w:rPr>
@@ -708,7 +708,7 @@
           <w:lang w:eastAsia="pt-BR"/>
         </w:rPr>
       </w:pPr>
-      <w:hyperlink w:anchor="_Toc243258022" w:history="1">
+      <w:hyperlink w:anchor="_Toc243435575" w:history="1">
         <w:r>
           <w:rPr>
             <w:rStyle w:val="Hyperlink"/>
@@ -731,7 +731,7 @@
           <w:rPr>
             <w:webHidden/>
           </w:rPr>
-          <w:instrText xml:space="preserve"> PAGEREF _Toc243258022 \h </w:instrText>
+          <w:instrText xml:space="preserve"> PAGEREF _Toc243435575 \h </w:instrText>
         </w:r>
         <w:r>
           <w:rPr>
@@ -766,7 +766,7 @@
           <w:lang w:eastAsia="pt-BR"/>
         </w:rPr>
       </w:pPr>
-      <w:hyperlink w:anchor="_Toc243258023" w:history="1">
+      <w:hyperlink w:anchor="_Toc243435576" w:history="1">
         <w:r>
           <w:rPr>
             <w:rStyle w:val="Hyperlink"/>
@@ -789,7 +789,7 @@
           <w:rPr>
             <w:webHidden/>
           </w:rPr>
-          <w:instrText xml:space="preserve"> PAGEREF _Toc243258023 \h </w:instrText>
+          <w:instrText xml:space="preserve"> PAGEREF _Toc243435576 \h </w:instrText>
         </w:r>
         <w:r>
           <w:rPr>
@@ -824,7 +824,7 @@
           <w:lang w:eastAsia="pt-BR"/>
         </w:rPr>
       </w:pPr>
-      <w:hyperlink w:anchor="_Toc243258024" w:history="1">
+      <w:hyperlink w:anchor="_Toc243435577" w:history="1">
         <w:r>
           <w:rPr>
             <w:rStyle w:val="Hyperlink"/>
@@ -847,7 +847,7 @@
           <w:rPr>
             <w:webHidden/>
           </w:rPr>
-          <w:instrText xml:space="preserve"> PAGEREF _Toc243258024 \h </w:instrText>
+          <w:instrText xml:space="preserve"> PAGEREF _Toc243435577 \h </w:instrText>
         </w:r>
         <w:r>
           <w:rPr>
@@ -882,7 +882,7 @@
           <w:lang w:eastAsia="pt-BR"/>
         </w:rPr>
       </w:pPr>
-      <w:hyperlink w:anchor="_Toc243258025" w:history="1">
+      <w:hyperlink w:anchor="_Toc243435578" w:history="1">
         <w:r>
           <w:rPr>
             <w:rStyle w:val="Hyperlink"/>
@@ -905,7 +905,7 @@
           <w:rPr>
             <w:webHidden/>
           </w:rPr>
-          <w:instrText xml:space="preserve"> PAGEREF _Toc243258025 \h </w:instrText>
+          <w:instrText xml:space="preserve"> PAGEREF _Toc243435578 \h </w:instrText>
         </w:r>
         <w:r>
           <w:rPr>
@@ -940,7 +940,7 @@
           <w:lang w:eastAsia="pt-BR"/>
         </w:rPr>
       </w:pPr>
-      <w:hyperlink w:anchor="_Toc243258026" w:history="1">
+      <w:hyperlink w:anchor="_Toc243435579" w:history="1">
         <w:r>
           <w:rPr>
             <w:rStyle w:val="Hyperlink"/>
@@ -963,7 +963,7 @@
           <w:rPr>
             <w:webHidden/>
           </w:rPr>
-          <w:instrText xml:space="preserve"> PAGEREF _Toc243258026 \h </w:instrText>
+          <w:instrText xml:space="preserve"> PAGEREF _Toc243435579 \h </w:instrText>
         </w:r>
         <w:r>
           <w:rPr>
@@ -998,7 +998,7 @@
           <w:lang w:eastAsia="pt-BR"/>
         </w:rPr>
       </w:pPr>
-      <w:hyperlink w:anchor="_Toc243258027" w:history="1">
+      <w:hyperlink w:anchor="_Toc243435580" w:history="1">
         <w:r>
           <w:rPr>
             <w:rStyle w:val="Hyperlink"/>
@@ -1021,7 +1021,7 @@
           <w:rPr>
             <w:webHidden/>
           </w:rPr>
-          <w:instrText xml:space="preserve"> PAGEREF _Toc243258027 \h </w:instrText>
+          <w:instrText xml:space="preserve"> PAGEREF _Toc243435580 \h </w:instrText>
         </w:r>
         <w:r>
           <w:rPr>
@@ -1058,7 +1058,7 @@
           <w:lang w:eastAsia="pt-BR"/>
         </w:rPr>
       </w:pPr>
-      <w:hyperlink w:anchor="_Toc243258028" w:history="1">
+      <w:hyperlink w:anchor="_Toc243435581" w:history="1">
         <w:r>
           <w:rPr>
             <w:rStyle w:val="Hyperlink"/>
@@ -1081,7 +1081,7 @@
           <w:rPr>
             <w:webHidden/>
           </w:rPr>
-          <w:instrText xml:space="preserve"> PAGEREF _Toc243258028 \h </w:instrText>
+          <w:instrText xml:space="preserve"> PAGEREF _Toc243435581 \h </w:instrText>
         </w:r>
         <w:r>
           <w:rPr>
@@ -1116,7 +1116,7 @@
           <w:lang w:eastAsia="pt-BR"/>
         </w:rPr>
       </w:pPr>
-      <w:hyperlink w:anchor="_Toc243258029" w:history="1">
+      <w:hyperlink w:anchor="_Toc243435582" w:history="1">
         <w:r>
           <w:rPr>
             <w:rStyle w:val="Hyperlink"/>
@@ -1139,7 +1139,7 @@
           <w:rPr>
             <w:webHidden/>
           </w:rPr>
-          <w:instrText xml:space="preserve"> PAGEREF _Toc243258029 \h </w:instrText>
+          <w:instrText xml:space="preserve"> PAGEREF _Toc243435582 \h </w:instrText>
         </w:r>
         <w:r>
           <w:rPr>
@@ -1174,7 +1174,7 @@
           <w:lang w:eastAsia="pt-BR"/>
         </w:rPr>
       </w:pPr>
-      <w:hyperlink w:anchor="_Toc243258030" w:history="1">
+      <w:hyperlink w:anchor="_Toc243435583" w:history="1">
         <w:r>
           <w:rPr>
             <w:rStyle w:val="Hyperlink"/>
@@ -1197,7 +1197,7 @@
           <w:rPr>
             <w:webHidden/>
           </w:rPr>
-          <w:instrText xml:space="preserve"> PAGEREF _Toc243258030 \h </w:instrText>
+          <w:instrText xml:space="preserve"> PAGEREF _Toc243435583 \h </w:instrText>
         </w:r>
         <w:r>
           <w:rPr>
@@ -1234,7 +1234,7 @@
           <w:lang w:eastAsia="pt-BR"/>
         </w:rPr>
       </w:pPr>
-      <w:hyperlink w:anchor="_Toc243258031" w:history="1">
+      <w:hyperlink w:anchor="_Toc243435584" w:history="1">
         <w:r>
           <w:rPr>
             <w:rStyle w:val="Hyperlink"/>
@@ -1257,7 +1257,7 @@
           <w:rPr>
             <w:webHidden/>
           </w:rPr>
-          <w:instrText xml:space="preserve"> PAGEREF _Toc243258031 \h </w:instrText>
+          <w:instrText xml:space="preserve"> PAGEREF _Toc243435584 \h </w:instrText>
         </w:r>
         <w:r>
           <w:rPr>
@@ -1292,7 +1292,7 @@
           <w:lang w:eastAsia="pt-BR"/>
         </w:rPr>
       </w:pPr>
-      <w:hyperlink w:anchor="_Toc243258032" w:history="1">
+      <w:hyperlink w:anchor="_Toc243435585" w:history="1">
         <w:r>
           <w:rPr>
             <w:rStyle w:val="Hyperlink"/>
@@ -1315,7 +1315,7 @@
           <w:rPr>
             <w:webHidden/>
           </w:rPr>
-          <w:instrText xml:space="preserve"> PAGEREF _Toc243258032 \h </w:instrText>
+          <w:instrText xml:space="preserve"> PAGEREF _Toc243435585 \h </w:instrText>
         </w:r>
         <w:r>
           <w:rPr>
@@ -1350,7 +1350,7 @@
           <w:lang w:eastAsia="pt-BR"/>
         </w:rPr>
       </w:pPr>
-      <w:hyperlink w:anchor="_Toc243258033" w:history="1">
+      <w:hyperlink w:anchor="_Toc243435586" w:history="1">
         <w:r>
           <w:rPr>
             <w:rStyle w:val="Hyperlink"/>
@@ -1373,7 +1373,7 @@
           <w:rPr>
             <w:webHidden/>
           </w:rPr>
-          <w:instrText xml:space="preserve"> PAGEREF _Toc243258033 \h </w:instrText>
+          <w:instrText xml:space="preserve"> PAGEREF _Toc243435586 \h </w:instrText>
         </w:r>
         <w:r>
           <w:rPr>
@@ -1408,7 +1408,7 @@
           <w:lang w:eastAsia="pt-BR"/>
         </w:rPr>
       </w:pPr>
-      <w:hyperlink w:anchor="_Toc243258034" w:history="1">
+      <w:hyperlink w:anchor="_Toc243435587" w:history="1">
         <w:r>
           <w:rPr>
             <w:rStyle w:val="Hyperlink"/>
@@ -1431,7 +1431,7 @@
           <w:rPr>
             <w:webHidden/>
           </w:rPr>
-          <w:instrText xml:space="preserve"> PAGEREF _Toc243258034 \h </w:instrText>
+          <w:instrText xml:space="preserve"> PAGEREF _Toc243435587 \h </w:instrText>
         </w:r>
         <w:r>
           <w:rPr>
@@ -1466,7 +1466,7 @@
           <w:lang w:eastAsia="pt-BR"/>
         </w:rPr>
       </w:pPr>
-      <w:hyperlink w:anchor="_Toc243258035" w:history="1">
+      <w:hyperlink w:anchor="_Toc243435588" w:history="1">
         <w:r>
           <w:rPr>
             <w:rStyle w:val="Hyperlink"/>
@@ -1489,7 +1489,7 @@
           <w:rPr>
             <w:webHidden/>
           </w:rPr>
-          <w:instrText xml:space="preserve"> PAGEREF _Toc243258035 \h </w:instrText>
+          <w:instrText xml:space="preserve"> PAGEREF _Toc243435588 \h </w:instrText>
         </w:r>
         <w:r>
           <w:rPr>
@@ -1526,7 +1526,7 @@
           <w:lang w:eastAsia="pt-BR"/>
         </w:rPr>
       </w:pPr>
-      <w:hyperlink w:anchor="_Toc243258036" w:history="1">
+      <w:hyperlink w:anchor="_Toc243435589" w:history="1">
         <w:r>
           <w:rPr>
             <w:rStyle w:val="Hyperlink"/>
@@ -1549,7 +1549,7 @@
           <w:rPr>
             <w:webHidden/>
           </w:rPr>
-          <w:instrText xml:space="preserve"> PAGEREF _Toc243258036 \h </w:instrText>
+          <w:instrText xml:space="preserve"> PAGEREF _Toc243435589 \h </w:instrText>
         </w:r>
         <w:r>
           <w:rPr>
@@ -1584,7 +1584,7 @@
           <w:lang w:eastAsia="pt-BR"/>
         </w:rPr>
       </w:pPr>
-      <w:hyperlink w:anchor="_Toc243258037" w:history="1">
+      <w:hyperlink w:anchor="_Toc243435590" w:history="1">
         <w:r>
           <w:rPr>
             <w:rStyle w:val="Hyperlink"/>
@@ -1607,7 +1607,7 @@
           <w:rPr>
             <w:webHidden/>
           </w:rPr>
-          <w:instrText xml:space="preserve"> PAGEREF _Toc243258037 \h </w:instrText>
+          <w:instrText xml:space="preserve"> PAGEREF _Toc243435590 \h </w:instrText>
         </w:r>
         <w:r>
           <w:rPr>
@@ -1642,7 +1642,7 @@
           <w:lang w:eastAsia="pt-BR"/>
         </w:rPr>
       </w:pPr>
-      <w:hyperlink w:anchor="_Toc243258038" w:history="1">
+      <w:hyperlink w:anchor="_Toc243435591" w:history="1">
         <w:r>
           <w:rPr>
             <w:rStyle w:val="Hyperlink"/>
@@ -1665,7 +1665,7 @@
           <w:rPr>
             <w:webHidden/>
           </w:rPr>
-          <w:instrText xml:space="preserve"> PAGEREF _Toc243258038 \h </w:instrText>
+          <w:instrText xml:space="preserve"> PAGEREF _Toc243435591 \h </w:instrText>
         </w:r>
         <w:r>
           <w:rPr>
@@ -1700,7 +1700,7 @@
           <w:lang w:eastAsia="pt-BR"/>
         </w:rPr>
       </w:pPr>
-      <w:hyperlink w:anchor="_Toc243258039" w:history="1">
+      <w:hyperlink w:anchor="_Toc243435592" w:history="1">
         <w:r>
           <w:rPr>
             <w:rStyle w:val="Hyperlink"/>
@@ -1723,7 +1723,7 @@
           <w:rPr>
             <w:webHidden/>
           </w:rPr>
-          <w:instrText xml:space="preserve"> PAGEREF _Toc243258039 \h </w:instrText>
+          <w:instrText xml:space="preserve"> PAGEREF _Toc243435592 \h </w:instrText>
         </w:r>
         <w:r>
           <w:rPr>
@@ -1758,7 +1758,7 @@
           <w:lang w:eastAsia="pt-BR"/>
         </w:rPr>
       </w:pPr>
-      <w:hyperlink w:anchor="_Toc243258040" w:history="1">
+      <w:hyperlink w:anchor="_Toc243435593" w:history="1">
         <w:r>
           <w:rPr>
             <w:rStyle w:val="Hyperlink"/>
@@ -1781,7 +1781,7 @@
           <w:rPr>
             <w:webHidden/>
           </w:rPr>
-          <w:instrText xml:space="preserve"> PAGEREF _Toc243258040 \h </w:instrText>
+          <w:instrText xml:space="preserve"> PAGEREF _Toc243435593 \h </w:instrText>
         </w:r>
         <w:r>
           <w:rPr>
@@ -1818,7 +1818,7 @@
           <w:lang w:eastAsia="pt-BR"/>
         </w:rPr>
       </w:pPr>
-      <w:hyperlink w:anchor="_Toc243258041" w:history="1">
+      <w:hyperlink w:anchor="_Toc243435594" w:history="1">
         <w:r>
           <w:rPr>
             <w:rStyle w:val="Hyperlink"/>
@@ -1841,7 +1841,7 @@
           <w:rPr>
             <w:webHidden/>
           </w:rPr>
-          <w:instrText xml:space="preserve"> PAGEREF _Toc243258041 \h </w:instrText>
+          <w:instrText xml:space="preserve"> PAGEREF _Toc243435594 \h </w:instrText>
         </w:r>
         <w:r>
           <w:rPr>
@@ -1876,7 +1876,7 @@
           <w:lang w:eastAsia="pt-BR"/>
         </w:rPr>
       </w:pPr>
-      <w:hyperlink w:anchor="_Toc243258042" w:history="1">
+      <w:hyperlink w:anchor="_Toc243435595" w:history="1">
         <w:r>
           <w:rPr>
             <w:rStyle w:val="Hyperlink"/>
@@ -1899,7 +1899,7 @@
           <w:rPr>
             <w:webHidden/>
           </w:rPr>
-          <w:instrText xml:space="preserve"> PAGEREF _Toc243258042 \h </w:instrText>
+          <w:instrText xml:space="preserve"> PAGEREF _Toc243435595 \h </w:instrText>
         </w:r>
         <w:r>
           <w:rPr>
@@ -1934,7 +1934,7 @@
           <w:lang w:eastAsia="pt-BR"/>
         </w:rPr>
       </w:pPr>
-      <w:hyperlink w:anchor="_Toc243258043" w:history="1">
+      <w:hyperlink w:anchor="_Toc243435596" w:history="1">
         <w:r>
           <w:rPr>
             <w:rStyle w:val="Hyperlink"/>
@@ -1957,7 +1957,7 @@
           <w:rPr>
             <w:webHidden/>
           </w:rPr>
-          <w:instrText xml:space="preserve"> PAGEREF _Toc243258043 \h </w:instrText>
+          <w:instrText xml:space="preserve"> PAGEREF _Toc243435596 \h </w:instrText>
         </w:r>
         <w:r>
           <w:rPr>
@@ -1992,7 +1992,7 @@
           <w:lang w:eastAsia="pt-BR"/>
         </w:rPr>
       </w:pPr>
-      <w:hyperlink w:anchor="_Toc243258044" w:history="1">
+      <w:hyperlink w:anchor="_Toc243435597" w:history="1">
         <w:r>
           <w:rPr>
             <w:rStyle w:val="Hyperlink"/>
@@ -2015,7 +2015,7 @@
           <w:rPr>
             <w:webHidden/>
           </w:rPr>
-          <w:instrText xml:space="preserve"> PAGEREF _Toc243258044 \h </w:instrText>
+          <w:instrText xml:space="preserve"> PAGEREF _Toc243435597 \h </w:instrText>
         </w:r>
         <w:r>
           <w:rPr>
@@ -2050,7 +2050,7 @@
           <w:lang w:eastAsia="pt-BR"/>
         </w:rPr>
       </w:pPr>
-      <w:hyperlink w:anchor="_Toc243258045" w:history="1">
+      <w:hyperlink w:anchor="_Toc243435598" w:history="1">
         <w:r>
           <w:rPr>
             <w:rStyle w:val="Hyperlink"/>
@@ -2073,7 +2073,7 @@
           <w:rPr>
             <w:webHidden/>
           </w:rPr>
-          <w:instrText xml:space="preserve"> PAGEREF _Toc243258045 \h </w:instrText>
+          <w:instrText xml:space="preserve"> PAGEREF _Toc243435598 \h </w:instrText>
         </w:r>
         <w:r>
           <w:rPr>
@@ -2110,7 +2110,7 @@
           <w:lang w:eastAsia="pt-BR"/>
         </w:rPr>
       </w:pPr>
-      <w:hyperlink w:anchor="_Toc243258046" w:history="1">
+      <w:hyperlink w:anchor="_Toc243435599" w:history="1">
         <w:r>
           <w:rPr>
             <w:rStyle w:val="Hyperlink"/>
@@ -2133,7 +2133,7 @@
           <w:rPr>
             <w:webHidden/>
           </w:rPr>
-          <w:instrText xml:space="preserve"> PAGEREF _Toc243258046 \h </w:instrText>
+          <w:instrText xml:space="preserve"> PAGEREF _Toc243435599 \h </w:instrText>
         </w:r>
         <w:r>
           <w:rPr>
@@ -2168,7 +2168,7 @@
           <w:lang w:eastAsia="pt-BR"/>
         </w:rPr>
       </w:pPr>
-      <w:hyperlink w:anchor="_Toc243258047" w:history="1">
+      <w:hyperlink w:anchor="_Toc243435600" w:history="1">
         <w:r>
           <w:rPr>
             <w:rStyle w:val="Hyperlink"/>
@@ -2191,7 +2191,7 @@
           <w:rPr>
             <w:webHidden/>
           </w:rPr>
-          <w:instrText xml:space="preserve"> PAGEREF _Toc243258047 \h </w:instrText>
+          <w:instrText xml:space="preserve"> PAGEREF _Toc243435600 \h </w:instrText>
         </w:r>
         <w:r>
           <w:rPr>
@@ -2226,7 +2226,7 @@
           <w:lang w:eastAsia="pt-BR"/>
         </w:rPr>
       </w:pPr>
-      <w:hyperlink w:anchor="_Toc243258048" w:history="1">
+      <w:hyperlink w:anchor="_Toc243435601" w:history="1">
         <w:r>
           <w:rPr>
             <w:rStyle w:val="Hyperlink"/>
@@ -2249,7 +2249,7 @@
           <w:rPr>
             <w:webHidden/>
           </w:rPr>
-          <w:instrText xml:space="preserve"> PAGEREF _Toc243258048 \h </w:instrText>
+          <w:instrText xml:space="preserve"> PAGEREF _Toc243435601 \h </w:instrText>
         </w:r>
         <w:r>
           <w:rPr>
@@ -2266,7 +2266,7 @@
           <w:rPr>
             <w:webHidden/>
           </w:rPr>
-          <w:t>30</w:t>
+          <w:t>31</w:t>
         </w:r>
         <w:r>
           <w:rPr>
@@ -2284,7 +2284,7 @@
           <w:lang w:eastAsia="pt-BR"/>
         </w:rPr>
       </w:pPr>
-      <w:hyperlink w:anchor="_Toc243258049" w:history="1">
+      <w:hyperlink w:anchor="_Toc243435602" w:history="1">
         <w:r>
           <w:rPr>
             <w:rStyle w:val="Hyperlink"/>
@@ -2307,7 +2307,7 @@
           <w:rPr>
             <w:webHidden/>
           </w:rPr>
-          <w:instrText xml:space="preserve"> PAGEREF _Toc243258049 \h </w:instrText>
+          <w:instrText xml:space="preserve"> PAGEREF _Toc243435602 \h </w:instrText>
         </w:r>
         <w:r>
           <w:rPr>
@@ -2324,7 +2324,7 @@
           <w:rPr>
             <w:webHidden/>
           </w:rPr>
-          <w:t>31</w:t>
+          <w:t>32</w:t>
         </w:r>
         <w:r>
           <w:rPr>
@@ -2342,7 +2342,7 @@
           <w:lang w:eastAsia="pt-BR"/>
         </w:rPr>
       </w:pPr>
-      <w:hyperlink w:anchor="_Toc243258050" w:history="1">
+      <w:hyperlink w:anchor="_Toc243435603" w:history="1">
         <w:r>
           <w:rPr>
             <w:rStyle w:val="Hyperlink"/>
@@ -2365,7 +2365,7 @@
           <w:rPr>
             <w:webHidden/>
           </w:rPr>
-          <w:instrText xml:space="preserve"> PAGEREF _Toc243258050 \h </w:instrText>
+          <w:instrText xml:space="preserve"> PAGEREF _Toc243435603 \h </w:instrText>
         </w:r>
         <w:r>
           <w:rPr>
@@ -2382,7 +2382,7 @@
           <w:rPr>
             <w:webHidden/>
           </w:rPr>
-          <w:t>31</w:t>
+          <w:t>32</w:t>
         </w:r>
         <w:r>
           <w:rPr>
@@ -2402,7 +2402,7 @@
           <w:lang w:eastAsia="pt-BR"/>
         </w:rPr>
       </w:pPr>
-      <w:hyperlink w:anchor="_Toc243258051" w:history="1">
+      <w:hyperlink w:anchor="_Toc243435604" w:history="1">
         <w:r>
           <w:rPr>
             <w:rStyle w:val="Hyperlink"/>
@@ -2425,7 +2425,7 @@
           <w:rPr>
             <w:webHidden/>
           </w:rPr>
-          <w:instrText xml:space="preserve"> PAGEREF _Toc243258051 \h </w:instrText>
+          <w:instrText xml:space="preserve"> PAGEREF _Toc243435604 \h </w:instrText>
         </w:r>
         <w:r>
           <w:rPr>
@@ -2442,7 +2442,7 @@
           <w:rPr>
             <w:webHidden/>
           </w:rPr>
-          <w:t>32</w:t>
+          <w:t>33</w:t>
         </w:r>
         <w:r>
           <w:rPr>
@@ -2462,7 +2462,7 @@
           <w:lang w:eastAsia="pt-BR"/>
         </w:rPr>
       </w:pPr>
-      <w:hyperlink w:anchor="_Toc243258052" w:history="1">
+      <w:hyperlink w:anchor="_Toc243435605" w:history="1">
         <w:r>
           <w:rPr>
             <w:rStyle w:val="Hyperlink"/>
@@ -2485,7 +2485,7 @@
           <w:rPr>
             <w:webHidden/>
           </w:rPr>
-          <w:instrText xml:space="preserve"> PAGEREF _Toc243258052 \h </w:instrText>
+          <w:instrText xml:space="preserve"> PAGEREF _Toc243435605 \h </w:instrText>
         </w:r>
         <w:r>
           <w:rPr>
@@ -2502,7 +2502,7 @@
           <w:rPr>
             <w:webHidden/>
           </w:rPr>
-          <w:t>33</w:t>
+          <w:t>34</w:t>
         </w:r>
         <w:r>
           <w:rPr>
@@ -2534,7 +2534,7 @@
       <w:pPr>
         <w:pStyle w:val="Ttulo1"/>
       </w:pPr>
-      <w:bookmarkStart w:id="0" w:name="_Toc243258014"/>
+      <w:bookmarkStart w:id="0" w:name="_Toc243435567"/>
       <w:r>
         <w:lastRenderedPageBreak/>
         <w:t>INTRODUÇÃO</w:t>
@@ -2580,7 +2580,7 @@
       <w:pPr>
         <w:pStyle w:val="Ttulo2"/>
       </w:pPr>
-      <w:bookmarkStart w:id="1" w:name="_Toc243258015"/>
+      <w:bookmarkStart w:id="1" w:name="_Toc243435568"/>
       <w:r>
         <w:t>Convenções Adotadas</w:t>
       </w:r>
@@ -2648,7 +2648,7 @@
       <w:pPr>
         <w:pStyle w:val="Ttulo1"/>
       </w:pPr>
-      <w:bookmarkStart w:id="2" w:name="_Toc243258016"/>
+      <w:bookmarkStart w:id="2" w:name="_Toc243435569"/>
       <w:r>
         <w:lastRenderedPageBreak/>
         <w:t>FUNDAMENTOS</w:t>
@@ -2659,7 +2659,7 @@
       <w:pPr>
         <w:pStyle w:val="Ttulo2"/>
       </w:pPr>
-      <w:bookmarkStart w:id="3" w:name="_Toc243258017"/>
+      <w:bookmarkStart w:id="3" w:name="_Toc243435570"/>
       <w:r>
         <w:t>Desenvolvimento Assistido por IA</w:t>
       </w:r>
@@ -2714,7 +2714,7 @@
       <w:pPr>
         <w:pStyle w:val="Ttulo2"/>
       </w:pPr>
-      <w:bookmarkStart w:id="4" w:name="_Toc243258018"/>
+      <w:bookmarkStart w:id="4" w:name="_Toc243435571"/>
       <w:r>
         <w:t>Interpretable Context Methodology</w:t>
       </w:r>
@@ -3235,7 +3235,7 @@
       <w:pPr>
         <w:pStyle w:val="Ttulo2"/>
       </w:pPr>
-      <w:bookmarkStart w:id="5" w:name="_Toc243258019"/>
+      <w:bookmarkStart w:id="5" w:name="_Toc243435572"/>
       <w:r>
         <w:t>Economia de Contexto</w:t>
       </w:r>
@@ -3283,7 +3283,7 @@
       <w:pPr>
         <w:pStyle w:val="Ttulo2"/>
       </w:pPr>
-      <w:bookmarkStart w:id="6" w:name="_Toc243258020"/>
+      <w:bookmarkStart w:id="6" w:name="_Toc243435573"/>
       <w:r>
         <w:t>Adaptação ao Desenvolvimento de Software</w:t>
       </w:r>
@@ -3357,7 +3357,7 @@
       <w:pPr>
         <w:pStyle w:val="Ttulo1"/>
       </w:pPr>
-      <w:bookmarkStart w:id="7" w:name="_Toc243258021"/>
+      <w:bookmarkStart w:id="7" w:name="_Toc243435574"/>
       <w:r>
         <w:lastRenderedPageBreak/>
         <w:t>ARQUITETURA DE DIRETÓRIOS</w:t>
@@ -4332,7 +4332,7 @@
       <w:pPr>
         <w:pStyle w:val="Ttulo2"/>
       </w:pPr>
-      <w:bookmarkStart w:id="8" w:name="_Toc243258022"/>
+      <w:bookmarkStart w:id="8" w:name="_Toc243435575"/>
       <w:r>
         <w:t>Identidade: AGENTS.md e CLAUDE.md</w:t>
       </w:r>
@@ -4768,7 +4768,7 @@
       <w:pPr>
         <w:pStyle w:val="Ttulo2"/>
       </w:pPr>
-      <w:bookmarkStart w:id="9" w:name="_Toc243258023"/>
+      <w:bookmarkStart w:id="9" w:name="_Toc243435576"/>
       <w:r>
         <w:t>Roteamento: guia/</w:t>
       </w:r>
@@ -5503,7 +5503,7 @@
       <w:pPr>
         <w:pStyle w:val="Ttulo2"/>
       </w:pPr>
-      <w:bookmarkStart w:id="10" w:name="_Toc243258024"/>
+      <w:bookmarkStart w:id="10" w:name="_Toc243435577"/>
       <w:r>
         <w:t>Contratos das Etapas: workflows/</w:t>
       </w:r>
@@ -5774,7 +5774,7 @@
       <w:pPr>
         <w:pStyle w:val="Ttulo2"/>
       </w:pPr>
-      <w:bookmarkStart w:id="11" w:name="_Toc243258025"/>
+      <w:bookmarkStart w:id="11" w:name="_Toc243435578"/>
       <w:r>
         <w:t>Referências: docs/</w:t>
       </w:r>
@@ -6174,7 +6174,7 @@
       <w:pPr>
         <w:pStyle w:val="Ttulo2"/>
       </w:pPr>
-      <w:bookmarkStart w:id="12" w:name="_Toc243258026"/>
+      <w:bookmarkStart w:id="12" w:name="_Toc243435579"/>
       <w:r>
         <w:t>Memória das Tarefas: memoria/</w:t>
       </w:r>
@@ -6819,7 +6819,7 @@
       <w:pPr>
         <w:pStyle w:val="Ttulo2"/>
       </w:pPr>
-      <w:bookmarkStart w:id="13" w:name="_Toc243258027"/>
+      <w:bookmarkStart w:id="13" w:name="_Toc243435580"/>
       <w:r>
         <w:t>Configuração e Apoio</w:t>
       </w:r>
@@ -7116,7 +7116,7 @@
       <w:pPr>
         <w:pStyle w:val="Ttulo1"/>
       </w:pPr>
-      <w:bookmarkStart w:id="14" w:name="_Toc243258028"/>
+      <w:bookmarkStart w:id="14" w:name="_Toc243435581"/>
       <w:r>
         <w:lastRenderedPageBreak/>
         <w:t>CICLO DE DESENVOLVIMENTO</w:t>
@@ -7828,7 +7828,7 @@
       <w:pPr>
         <w:pStyle w:val="Ttulo2"/>
       </w:pPr>
-      <w:bookmarkStart w:id="15" w:name="_Toc243258029"/>
+      <w:bookmarkStart w:id="15" w:name="_Toc243435582"/>
       <w:r>
         <w:t>Pontos de Controle Humano</w:t>
       </w:r>
@@ -7916,7 +7916,7 @@
       <w:pPr>
         <w:pStyle w:val="Ttulo2"/>
       </w:pPr>
-      <w:bookmarkStart w:id="16" w:name="_Toc243258030"/>
+      <w:bookmarkStart w:id="16" w:name="_Toc243435583"/>
       <w:r>
         <w:t>Variações por Tipo de Tarefa</w:t>
       </w:r>
@@ -8086,7 +8086,7 @@
       <w:pPr>
         <w:pStyle w:val="Ttulo1"/>
       </w:pPr>
-      <w:bookmarkStart w:id="17" w:name="_Toc243258031"/>
+      <w:bookmarkStart w:id="17" w:name="_Toc243435584"/>
       <w:r>
         <w:lastRenderedPageBreak/>
         <w:t>REGRAS DA IA</w:t>
@@ -8116,7 +8116,7 @@
       <w:pPr>
         <w:pStyle w:val="Ttulo2"/>
       </w:pPr>
-      <w:bookmarkStart w:id="18" w:name="_Toc243258032"/>
+      <w:bookmarkStart w:id="18" w:name="_Toc243435585"/>
       <w:r>
         <w:t>Limites</w:t>
       </w:r>
@@ -8381,7 +8381,7 @@
       <w:pPr>
         <w:pStyle w:val="Ttulo2"/>
       </w:pPr>
-      <w:bookmarkStart w:id="19" w:name="_Toc243258033"/>
+      <w:bookmarkStart w:id="19" w:name="_Toc243435586"/>
       <w:r>
         <w:lastRenderedPageBreak/>
         <w:t>Quando Parar e Perguntar</w:t>
@@ -8524,7 +8524,7 @@
       <w:pPr>
         <w:pStyle w:val="Ttulo2"/>
       </w:pPr>
-      <w:bookmarkStart w:id="20" w:name="_Toc243258034"/>
+      <w:bookmarkStart w:id="20" w:name="_Toc243435587"/>
       <w:r>
         <w:t>Como Programar</w:t>
       </w:r>
@@ -8819,7 +8819,30 @@
         <w:t>middleware.ts</w:t>
       </w:r>
       <w:r>
-        <w:t>; o Tailwind CSS 4 configura o tema em CSS; e o Zod 4 e o ESLint 9 mudaram em relação às versões anteriores;</w:t>
+        <w:t xml:space="preserve">; o Tailwind CSS 4 configura o tema em CSS; </w:t>
+      </w:r>
+      <w:r>
+        <w:t xml:space="preserve">o Zod 4 e o ESLint 9 mudaram em relação às versões anteriores; e o shadcn/ui usa o Base UI, com a propriedade </w:t>
+      </w:r>
+      <w:r>
+        <w:rPr>
+          <w:rFonts w:ascii="Courier New" w:hAnsi="Courier New" w:cs="Courier New"/>
+          <w:sz w:val="22"/>
+        </w:rPr>
+        <w:t>render</w:t>
+      </w:r>
+      <w:r>
+        <w:t xml:space="preserve"> no lugar do </w:t>
+      </w:r>
+      <w:r>
+        <w:rPr>
+          <w:rFonts w:ascii="Courier New" w:hAnsi="Courier New" w:cs="Courier New"/>
+          <w:sz w:val="22"/>
+        </w:rPr>
+        <w:t>asChild</w:t>
+      </w:r>
+      <w:r>
+        <w:t xml:space="preserve"> do Radix;</w:t>
       </w:r>
     </w:p>
     <w:p>
@@ -8848,7 +8871,7 @@
       <w:pPr>
         <w:pStyle w:val="Ttulo2"/>
       </w:pPr>
-      <w:bookmarkStart w:id="21" w:name="_Toc243258035"/>
+      <w:bookmarkStart w:id="21" w:name="_Toc243435588"/>
       <w:r>
         <w:t>Uso do Contexto</w:t>
       </w:r>
@@ -9005,7 +9028,7 @@
       <w:pPr>
         <w:pStyle w:val="Ttulo1"/>
       </w:pPr>
-      <w:bookmarkStart w:id="22" w:name="_Toc243258036"/>
+      <w:bookmarkStart w:id="22" w:name="_Toc243435589"/>
       <w:r>
         <w:lastRenderedPageBreak/>
         <w:t>DIRETRIZES DE SEGURANÇA</w:t>
@@ -9024,7 +9047,7 @@
       <w:pPr>
         <w:pStyle w:val="Ttulo2"/>
       </w:pPr>
-      <w:bookmarkStart w:id="23" w:name="_Toc243258037"/>
+      <w:bookmarkStart w:id="23" w:name="_Toc243435590"/>
       <w:r>
         <w:t>Dados e Segredos</w:t>
       </w:r>
@@ -9169,7 +9192,7 @@
       <w:pPr>
         <w:pStyle w:val="Ttulo2"/>
       </w:pPr>
-      <w:bookmarkStart w:id="24" w:name="_Toc243258038"/>
+      <w:bookmarkStart w:id="24" w:name="_Toc243435591"/>
       <w:r>
         <w:t>Permissões do Agente</w:t>
       </w:r>
@@ -9453,7 +9476,7 @@
       <w:pPr>
         <w:pStyle w:val="Ttulo2"/>
       </w:pPr>
-      <w:bookmarkStart w:id="25" w:name="_Toc243258039"/>
+      <w:bookmarkStart w:id="25" w:name="_Toc243435592"/>
       <w:r>
         <w:t>Revisão de Segurança do Código Gerado</w:t>
       </w:r>
@@ -9866,7 +9889,7 @@
       <w:pPr>
         <w:pStyle w:val="Ttulo2"/>
       </w:pPr>
-      <w:bookmarkStart w:id="26" w:name="_Toc243258040"/>
+      <w:bookmarkStart w:id="26" w:name="_Toc243435593"/>
       <w:r>
         <w:t>Dependências e Conteúdo Externo</w:t>
       </w:r>
@@ -9954,7 +9977,7 @@
       <w:pPr>
         <w:pStyle w:val="Ttulo1"/>
       </w:pPr>
-      <w:bookmarkStart w:id="27" w:name="_Toc243258041"/>
+      <w:bookmarkStart w:id="27" w:name="_Toc243435594"/>
       <w:r>
         <w:lastRenderedPageBreak/>
         <w:t>WORKFLOW DA EQUIPE</w:t>
@@ -9965,7 +9988,7 @@
       <w:pPr>
         <w:pStyle w:val="Ttulo2"/>
       </w:pPr>
-      <w:bookmarkStart w:id="28" w:name="_Toc243258042"/>
+      <w:bookmarkStart w:id="28" w:name="_Toc243435595"/>
       <w:r>
         <w:t>Áreas e Divisão das Tarefas</w:t>
       </w:r>
@@ -10487,7 +10510,7 @@
       <w:pPr>
         <w:pStyle w:val="Ttulo2"/>
       </w:pPr>
-      <w:bookmarkStart w:id="29" w:name="_Toc243258043"/>
+      <w:bookmarkStart w:id="29" w:name="_Toc243435596"/>
       <w:r>
         <w:t>Gestão das Tarefas</w:t>
       </w:r>
@@ -10696,7 +10719,7 @@
       <w:pPr>
         <w:pStyle w:val="Ttulo2"/>
       </w:pPr>
-      <w:bookmarkStart w:id="30" w:name="_Toc243258044"/>
+      <w:bookmarkStart w:id="30" w:name="_Toc243435597"/>
       <w:r>
         <w:t>Ramificações, Commits e Conflitos</w:t>
       </w:r>
@@ -11113,7 +11136,7 @@
       <w:pPr>
         <w:pStyle w:val="Ttulo2"/>
       </w:pPr>
-      <w:bookmarkStart w:id="31" w:name="_Toc243258045"/>
+      <w:bookmarkStart w:id="31" w:name="_Toc243435598"/>
       <w:r>
         <w:t>Pull Requests e Revisão</w:t>
       </w:r>
@@ -11354,7 +11377,7 @@
       <w:pPr>
         <w:pStyle w:val="Ttulo1"/>
       </w:pPr>
-      <w:bookmarkStart w:id="32" w:name="_Toc243258046"/>
+      <w:bookmarkStart w:id="32" w:name="_Toc243435599"/>
       <w:r>
         <w:lastRenderedPageBreak/>
         <w:t>QA (QUALITY ASSURANCE)</w:t>
@@ -11383,7 +11406,7 @@
       <w:pPr>
         <w:pStyle w:val="Ttulo2"/>
       </w:pPr>
-      <w:bookmarkStart w:id="33" w:name="_Toc243258047"/>
+      <w:bookmarkStart w:id="33" w:name="_Toc243435600"/>
       <w:r>
         <w:t>Testes Automatizados</w:t>
       </w:r>
@@ -11395,7 +11418,163 @@
         <w:keepNext/>
       </w:pPr>
       <w:r>
-        <w:t>O Vitest testa as funções puras das regras de negócio (Documentação de Arquitetura, seção 4.2) e os esquemas de validação compartilhados. O Quadro 9 indica os casos que os testes de cada módulo devem cobrir.</w:t>
+        <w:t>O Vitest testa as funções puras das regras de negócio (Documentação de Arquitetura, seção 4.2)</w:t>
+      </w:r>
+      <w:r>
+        <w:t>, os esquemas de validação compartilhados, o tratamento único das requisições (</w:t>
+      </w:r>
+      <w:r>
+        <w:rPr>
+          <w:rFonts w:ascii="Courier New" w:hAnsi="Courier New" w:cs="Courier New"/>
+          <w:sz w:val="22"/>
+        </w:rPr>
+        <w:t>src/server/http</w:t>
+      </w:r>
+      <w:r>
+        <w:t xml:space="preserve">), com </w:t>
+      </w:r>
+      <w:r>
+        <w:rPr>
+          <w:rFonts w:ascii="Courier New" w:hAnsi="Courier New" w:cs="Courier New"/>
+          <w:sz w:val="22"/>
+        </w:rPr>
+        <w:t>Request</w:t>
+      </w:r>
+      <w:r>
+        <w:t xml:space="preserve"> e </w:t>
+      </w:r>
+      <w:r>
+        <w:rPr>
+          <w:rFonts w:ascii="Courier New" w:hAnsi="Courier New" w:cs="Courier New"/>
+          <w:sz w:val="22"/>
+        </w:rPr>
+        <w:t>Response</w:t>
+      </w:r>
+      <w:r>
+        <w:t xml:space="preserve"> padrão, sem servidor, o cliente da API (</w:t>
+      </w:r>
+      <w:r>
+        <w:rPr>
+          <w:rFonts w:ascii="Courier New" w:hAnsi="Courier New" w:cs="Courier New"/>
+          <w:sz w:val="22"/>
+        </w:rPr>
+        <w:t>src/lib/api-client.ts</w:t>
+      </w:r>
+      <w:r>
+        <w:t xml:space="preserve">), com </w:t>
+      </w:r>
+      <w:r>
+        <w:rPr>
+          <w:rFonts w:ascii="Courier New" w:hAnsi="Courier New" w:cs="Courier New"/>
+          <w:sz w:val="22"/>
+        </w:rPr>
+        <w:t>fetch</w:t>
+      </w:r>
+      <w:r>
+        <w:t xml:space="preserve"> e </w:t>
+      </w:r>
+      <w:r>
+        <w:rPr>
+          <w:rFonts w:ascii="Courier New" w:hAnsi="Courier New" w:cs="Courier New"/>
+          <w:sz w:val="22"/>
+        </w:rPr>
+        <w:t>location</w:t>
+      </w:r>
+      <w:r>
+        <w:t xml:space="preserve"> simulados, as funções de exibição de </w:t>
+      </w:r>
+      <w:r>
+        <w:rPr>
+          <w:rFonts w:ascii="Courier New" w:hAnsi="Courier New" w:cs="Courier New"/>
+          <w:sz w:val="22"/>
+        </w:rPr>
+        <w:t>src/shared/format</w:t>
+      </w:r>
+      <w:r>
+        <w:t xml:space="preserve"> e a decisão de acesso às páginas (</w:t>
+      </w:r>
+      <w:r>
+        <w:rPr>
+          <w:rFonts w:ascii="Courier New" w:hAnsi="Courier New" w:cs="Courier New"/>
+          <w:sz w:val="22"/>
+        </w:rPr>
+        <w:t>src/server/auth/page-access.ts</w:t>
+      </w:r>
+      <w:r>
+        <w:t xml:space="preserve">). Os testes espelham o código, em </w:t>
+      </w:r>
+      <w:r>
+        <w:rPr>
+          <w:rFonts w:ascii="Courier New" w:hAnsi="Courier New" w:cs="Courier New"/>
+          <w:sz w:val="22"/>
+        </w:rPr>
+        <w:t>tests/rules/</w:t>
+      </w:r>
+      <w:r>
+        <w:t xml:space="preserve">, </w:t>
+      </w:r>
+      <w:r>
+        <w:rPr>
+          <w:rFonts w:ascii="Courier New" w:hAnsi="Courier New" w:cs="Courier New"/>
+          <w:sz w:val="22"/>
+        </w:rPr>
+        <w:t>tests/validation/</w:t>
+      </w:r>
+      <w:r>
+        <w:t xml:space="preserve">, </w:t>
+      </w:r>
+      <w:r>
+        <w:rPr>
+          <w:rFonts w:ascii="Courier New" w:hAnsi="Courier New" w:cs="Courier New"/>
+          <w:sz w:val="22"/>
+        </w:rPr>
+        <w:t>tests/http/</w:t>
+      </w:r>
+      <w:r>
+        <w:t xml:space="preserve">, </w:t>
+      </w:r>
+      <w:r>
+        <w:rPr>
+          <w:rFonts w:ascii="Courier New" w:hAnsi="Courier New" w:cs="Courier New"/>
+          <w:sz w:val="22"/>
+        </w:rPr>
+        <w:t>tests/lib/</w:t>
+      </w:r>
+      <w:r>
+        <w:t xml:space="preserve">, </w:t>
+      </w:r>
+      <w:r>
+        <w:rPr>
+          <w:rFonts w:ascii="Courier New" w:hAnsi="Courier New" w:cs="Courier New"/>
+          <w:sz w:val="22"/>
+        </w:rPr>
+        <w:t>tests/format/</w:t>
+      </w:r>
+      <w:r>
+        <w:t xml:space="preserve"> e </w:t>
+      </w:r>
+      <w:r>
+        <w:rPr>
+          <w:rFonts w:ascii="Courier New" w:hAnsi="Courier New" w:cs="Courier New"/>
+          <w:sz w:val="22"/>
+        </w:rPr>
+        <w:t>tests/auth/</w:t>
+      </w:r>
+      <w:r>
+        <w:t xml:space="preserve">; as telas, os componentes, o contexto da sessão e o </w:t>
+      </w:r>
+      <w:r>
+        <w:rPr>
+          <w:rFonts w:ascii="Courier New" w:hAnsi="Courier New" w:cs="Courier New"/>
+          <w:sz w:val="22"/>
+        </w:rPr>
+        <w:t>src/proxy.ts</w:t>
+      </w:r>
+      <w:r>
+        <w:t xml:space="preserve"> inteiro continuam testados à mão, na pré-visualização.</w:t>
+      </w:r>
+      <w:r>
+        <w:t xml:space="preserve"> O Quadro 9 indica os casos que os testes de cada módulo devem cobrir.</w:t>
       </w:r>
     </w:p>
     <w:p>
@@ -11515,9 +11694,36 @@
               <w:pStyle w:val="TextodeTabela"/>
             </w:pPr>
             <w:r>
-              <w:t>Valor por porte e valor fixo, soma dos itens, acréscimo, desconto, desconto de 100% e arredondamento ao centavo (</w:t>
-            </w:r>
-            <w:hyperlink r:id="rId25" w:anchor="RN009" w:history="1">
+              <w:t xml:space="preserve">Valor por porte e valor fixo, soma dos itens, acréscimo, desconto, </w:t>
+            </w:r>
+            <w:r>
+              <w:t>desconto de 100%, arredondamento ao centavo, inclusive o meio centavo, e composição dos serviços (</w:t>
+            </w:r>
+            <w:hyperlink r:id="rId25" w:anchor="RN005" w:history="1">
+              <w:r>
+                <w:rPr>
+                  <w:rStyle w:val="Hyperlink"/>
+                  <w:szCs w:val="24"/>
+                </w:rPr>
+                <w:t>RN005</w:t>
+              </w:r>
+            </w:hyperlink>
+            <w:r>
+              <w:t xml:space="preserve">, </w:t>
+            </w:r>
+            <w:hyperlink r:id="rId26" w:anchor="RN006" w:history="1">
+              <w:r>
+                <w:rPr>
+                  <w:rStyle w:val="Hyperlink"/>
+                  <w:szCs w:val="24"/>
+                </w:rPr>
+                <w:t>RN006</w:t>
+              </w:r>
+            </w:hyperlink>
+            <w:r>
+              <w:t xml:space="preserve">, </w:t>
+            </w:r>
+            <w:hyperlink r:id="rId27" w:anchor="RN009" w:history="1">
               <w:r>
                 <w:rPr>
                   <w:rStyle w:val="Hyperlink"/>
@@ -11528,7 +11734,7 @@
             <w:r>
               <w:t xml:space="preserve">, </w:t>
             </w:r>
-            <w:hyperlink r:id="rId26" w:anchor="RN010" w:history="1">
+            <w:hyperlink r:id="rId28" w:anchor="RN010" w:history="1">
               <w:r>
                 <w:rPr>
                   <w:rStyle w:val="Hyperlink"/>
@@ -11539,7 +11745,7 @@
             <w:r>
               <w:t xml:space="preserve">, </w:t>
             </w:r>
-            <w:hyperlink r:id="rId27" w:anchor="RN012" w:history="1">
+            <w:hyperlink r:id="rId29" w:anchor="RN012" w:history="1">
               <w:r>
                 <w:rPr>
                   <w:rStyle w:val="Hyperlink"/>
@@ -11581,7 +11787,7 @@
             <w:r>
               <w:t>Sequência completa, conclusão com troca da forma de pagamento, cancelamento pelo cliente e pelo funcionário e reagendamento único (</w:t>
             </w:r>
-            <w:hyperlink r:id="rId28" w:anchor="RN017" w:history="1">
+            <w:hyperlink r:id="rId30" w:anchor="RN017" w:history="1">
               <w:r>
                 <w:rPr>
                   <w:rStyle w:val="Hyperlink"/>
@@ -11592,7 +11798,7 @@
             <w:r>
               <w:t xml:space="preserve">, </w:t>
             </w:r>
-            <w:hyperlink r:id="rId29" w:anchor="RN018" w:history="1">
+            <w:hyperlink r:id="rId31" w:anchor="RN018" w:history="1">
               <w:r>
                 <w:rPr>
                   <w:rStyle w:val="Hyperlink"/>
@@ -11603,7 +11809,7 @@
             <w:r>
               <w:t xml:space="preserve">, </w:t>
             </w:r>
-            <w:hyperlink r:id="rId30" w:anchor="RN019" w:history="1">
+            <w:hyperlink r:id="rId32" w:anchor="RN019" w:history="1">
               <w:r>
                 <w:rPr>
                   <w:rStyle w:val="Hyperlink"/>
@@ -11614,7 +11820,7 @@
             <w:r>
               <w:t xml:space="preserve">, </w:t>
             </w:r>
-            <w:hyperlink r:id="rId31" w:anchor="RN020" w:history="1">
+            <w:hyperlink r:id="rId33" w:anchor="RN020" w:history="1">
               <w:r>
                 <w:rPr>
                   <w:rStyle w:val="Hyperlink"/>
@@ -11654,9 +11860,9 @@
               <w:pStyle w:val="TextodeTabela"/>
             </w:pPr>
             <w:r>
-              <w:t>Horário fora do expediente, na pausa, em dia fechado e no passado; previsão de conclusão que atravessa a pausa, a noite e dias fechados (</w:t>
-            </w:r>
-            <w:hyperlink r:id="rId32" w:anchor="RN013" w:history="1">
+              <w:t>Duração estimada; horário fora do expediente, na pausa, em dia fechado, fora dos intervalos de 30 minutos e no passado; previsão de conclusão que atravessa a pausa, a noite e dias fechados e que termina no encerramento (</w:t>
+            </w:r>
+            <w:hyperlink r:id="rId34" w:anchor="RN013" w:history="1">
               <w:r>
                 <w:rPr>
                   <w:rStyle w:val="Hyperlink"/>
@@ -11667,7 +11873,31 @@
             <w:r>
               <w:t xml:space="preserve">, </w:t>
             </w:r>
-            <w:hyperlink r:id="rId33" w:anchor="RN034" w:history="1">
+            <w:hyperlink r:id="rId35" w:anchor="RN014" w:history="1">
+              <w:r>
+                <w:rPr>
+                  <w:rStyle w:val="Hyperlink"/>
+                  <w:szCs w:val="24"/>
+                </w:rPr>
+                <w:t>RN014</w:t>
+              </w:r>
+            </w:hyperlink>
+            <w:r>
+              <w:t xml:space="preserve">, </w:t>
+            </w:r>
+            <w:hyperlink r:id="rId36" w:anchor="RN015" w:history="1">
+              <w:r>
+                <w:rPr>
+                  <w:rStyle w:val="Hyperlink"/>
+                  <w:szCs w:val="24"/>
+                </w:rPr>
+                <w:t>RN015</w:t>
+              </w:r>
+            </w:hyperlink>
+            <w:r>
+              <w:t xml:space="preserve">, </w:t>
+            </w:r>
+            <w:hyperlink r:id="rId37" w:anchor="RN034" w:history="1">
               <w:r>
                 <w:rPr>
                   <w:rStyle w:val="Hyperlink"/>
@@ -11707,9 +11937,9 @@
               <w:pStyle w:val="TextodeTabela"/>
             </w:pPr>
             <w:r>
-              <w:t>O cliente só posterga, o funcionário adianta ou posterga, e datas incompatíveis com o status são recusadas (</w:t>
-            </w:r>
-            <w:hyperlink r:id="rId34" w:anchor="RN032" w:history="1">
+              <w:t>Quem edita em cada status; o cliente só posterga, o funcionário adianta ou posterga, as datas incompatíveis com o status são recusadas, e a data mantida não é conferida de novo (</w:t>
+            </w:r>
+            <w:hyperlink r:id="rId38" w:anchor="RN032" w:history="1">
               <w:r>
                 <w:rPr>
                   <w:rStyle w:val="Hyperlink"/>
@@ -11720,7 +11950,7 @@
             <w:r>
               <w:t xml:space="preserve">, </w:t>
             </w:r>
-            <w:hyperlink r:id="rId35" w:anchor="RN033" w:history="1">
+            <w:hyperlink r:id="rId39" w:anchor="RN033" w:history="1">
               <w:r>
                 <w:rPr>
                   <w:rStyle w:val="Hyperlink"/>
@@ -11760,9 +11990,22 @@
               <w:pStyle w:val="TextodeTabela"/>
             </w:pPr>
             <w:r>
-              <w:t>Nomes com partículas, e-mail, celular, placa nos dois padrões, ano, CNPJ, senha e descarte de campos não previstos (</w:t>
-            </w:r>
-            <w:hyperlink r:id="rId36" w:anchor="RN035" w:history="1">
+              <w:t xml:space="preserve">Nomes com partículas, e-mail, celular, placa nos dois padrões, ano, CNPJ, </w:t>
+            </w:r>
+            <w:r>
+              <w:t xml:space="preserve">senha, descarte de campos não previstos, dado opcional vazio e versão do registro, o </w:t>
+            </w:r>
+            <w:r>
+              <w:rPr>
+                <w:rFonts w:ascii="Courier New" w:hAnsi="Courier New" w:cs="Courier New"/>
+                <w:sz w:val="18"/>
+              </w:rPr>
+              <w:t>updatedAt</w:t>
+            </w:r>
+            <w:r>
+              <w:t xml:space="preserve"> (</w:t>
+            </w:r>
+            <w:hyperlink r:id="rId40" w:anchor="RN035" w:history="1">
               <w:r>
                 <w:rPr>
                   <w:rStyle w:val="Hyperlink"/>
@@ -11776,6 +12019,326 @@
           </w:p>
         </w:tc>
       </w:tr>
+      <w:tr>
+        <w:trPr>
+          <w:cantSplit/>
+        </w:trPr>
+        <w:tc>
+          <w:tcPr>
+            <w:tcW w:w="2300" w:type="dxa"/>
+          </w:tcPr>
+          <w:p>
+            <w:pPr>
+              <w:pStyle w:val="TextodeTabela"/>
+            </w:pPr>
+            <w:r>
+              <w:lastRenderedPageBreak/>
+              <w:t>Tratamento único</w:t>
+            </w:r>
+          </w:p>
+        </w:tc>
+        <w:tc>
+          <w:tcPr>
+            <w:tcW w:w="6771" w:type="dxa"/>
+          </w:tcPr>
+          <w:p>
+            <w:pPr>
+              <w:pStyle w:val="TextodeTabela"/>
+            </w:pPr>
+            <w:r>
+              <w:t xml:space="preserve">Problem Details de </w:t>
+            </w:r>
+            <w:r>
+              <w:rPr>
+                <w:rFonts w:ascii="Courier New" w:hAnsi="Courier New" w:cs="Courier New"/>
+                <w:sz w:val="18"/>
+              </w:rPr>
+              <w:t>AppError</w:t>
+            </w:r>
+            <w:r>
+              <w:t xml:space="preserve">, de erro de validação e de erro inesperado; recusa por formato, tamanho e origem sem chegar à rota; registro sem senha, </w:t>
+            </w:r>
+            <w:r>
+              <w:rPr>
+                <w:i/>
+              </w:rPr>
+              <w:t>token</w:t>
+            </w:r>
+            <w:r>
+              <w:t xml:space="preserve">, </w:t>
+            </w:r>
+            <w:r>
+              <w:rPr>
+                <w:i/>
+              </w:rPr>
+              <w:t>cookie</w:t>
+            </w:r>
+            <w:r>
+              <w:t xml:space="preserve">, cabeçalho de autorização nem corpo; resposta fora de </w:t>
+            </w:r>
+            <w:r>
+              <w:rPr>
+                <w:i/>
+              </w:rPr>
+              <w:t>cache</w:t>
+            </w:r>
+            <w:r>
+              <w:t>; usuário em toda linha do registro (</w:t>
+            </w:r>
+            <w:hyperlink r:id="rId41" w:anchor="RS014" w:history="1">
+              <w:r>
+                <w:rPr>
+                  <w:rStyle w:val="Hyperlink"/>
+                  <w:szCs w:val="24"/>
+                </w:rPr>
+                <w:t>RS014</w:t>
+              </w:r>
+            </w:hyperlink>
+            <w:r>
+              <w:t xml:space="preserve">, </w:t>
+            </w:r>
+            <w:hyperlink r:id="rId42" w:anchor="RS017" w:history="1">
+              <w:r>
+                <w:rPr>
+                  <w:rStyle w:val="Hyperlink"/>
+                  <w:szCs w:val="24"/>
+                </w:rPr>
+                <w:t>RS017</w:t>
+              </w:r>
+            </w:hyperlink>
+            <w:r>
+              <w:t xml:space="preserve">, </w:t>
+            </w:r>
+            <w:hyperlink r:id="rId43" w:anchor="RS018" w:history="1">
+              <w:r>
+                <w:rPr>
+                  <w:rStyle w:val="Hyperlink"/>
+                  <w:szCs w:val="24"/>
+                </w:rPr>
+                <w:t>RS018</w:t>
+              </w:r>
+            </w:hyperlink>
+            <w:r>
+              <w:t>).</w:t>
+            </w:r>
+          </w:p>
+        </w:tc>
+      </w:tr>
+      <w:tr>
+        <w:trPr>
+          <w:cantSplit/>
+        </w:trPr>
+        <w:tc>
+          <w:tcPr>
+            <w:tcW w:w="2300" w:type="dxa"/>
+          </w:tcPr>
+          <w:p>
+            <w:pPr>
+              <w:pStyle w:val="TextodeTabela"/>
+            </w:pPr>
+            <w:r>
+              <w:t>Cliente da API</w:t>
+            </w:r>
+          </w:p>
+        </w:tc>
+        <w:tc>
+          <w:tcPr>
+            <w:tcW w:w="6771" w:type="dxa"/>
+          </w:tcPr>
+          <w:p>
+            <w:pPr>
+              <w:pStyle w:val="TextodeTabela"/>
+            </w:pPr>
+            <w:r>
+              <w:t xml:space="preserve">JSON e Problem Details; o 401 </w:t>
+            </w:r>
+            <w:r>
+              <w:rPr>
+                <w:rFonts w:ascii="Courier New" w:hAnsi="Courier New" w:cs="Courier New"/>
+                <w:sz w:val="18"/>
+              </w:rPr>
+              <w:t>UNAUTHENTICATED</w:t>
+            </w:r>
+            <w:r>
+              <w:t xml:space="preserve"> leva a </w:t>
+            </w:r>
+            <w:r>
+              <w:rPr>
+                <w:rFonts w:ascii="Courier New" w:hAnsi="Courier New" w:cs="Courier New"/>
+                <w:sz w:val="18"/>
+              </w:rPr>
+              <w:t>/login</w:t>
+            </w:r>
+            <w:r>
+              <w:t xml:space="preserve"> com a página atual, os outros 401 voltam à tela, e o da carga da sessão não sai da página; o 403 </w:t>
+            </w:r>
+            <w:r>
+              <w:rPr>
+                <w:rFonts w:ascii="Courier New" w:hAnsi="Courier New" w:cs="Courier New"/>
+                <w:sz w:val="18"/>
+              </w:rPr>
+              <w:t>PASSWORD_CHANGE_REQUIRED</w:t>
+            </w:r>
+            <w:r>
+              <w:t xml:space="preserve"> leva a </w:t>
+            </w:r>
+            <w:r>
+              <w:rPr>
+                <w:rFonts w:ascii="Courier New" w:hAnsi="Courier New" w:cs="Courier New"/>
+                <w:sz w:val="18"/>
+              </w:rPr>
+              <w:t>/set-password</w:t>
+            </w:r>
+            <w:r>
+              <w:t>; nenhuma chamada é repetida; falha de rede e resposta fora do formato; parâmetros de consulta, sem os vazios.</w:t>
+            </w:r>
+          </w:p>
+        </w:tc>
+      </w:tr>
+      <w:tr>
+        <w:trPr>
+          <w:cantSplit/>
+        </w:trPr>
+        <w:tc>
+          <w:tcPr>
+            <w:tcW w:w="2300" w:type="dxa"/>
+          </w:tcPr>
+          <w:p>
+            <w:pPr>
+              <w:pStyle w:val="TextodeTabela"/>
+            </w:pPr>
+            <w:r>
+              <w:t>Proteção das páginas</w:t>
+            </w:r>
+          </w:p>
+        </w:tc>
+        <w:tc>
+          <w:tcPr>
+            <w:tcW w:w="6771" w:type="dxa"/>
+          </w:tcPr>
+          <w:p>
+            <w:pPr>
+              <w:pStyle w:val="TextodeTabela"/>
+            </w:pPr>
+            <w:r>
+              <w:t xml:space="preserve">Visitante, troca de senha pendente, cliente, funcionário com e sem a permissão, sem nenhuma permissão e administrador, em cada tipo de página; parâmetro </w:t>
+            </w:r>
+            <w:r>
+              <w:rPr>
+                <w:rFonts w:ascii="Courier New" w:hAnsi="Courier New" w:cs="Courier New"/>
+                <w:sz w:val="18"/>
+              </w:rPr>
+              <w:t>next</w:t>
+            </w:r>
+            <w:r>
+              <w:t xml:space="preserve"> de outro site, da API e das telas de acesso (</w:t>
+            </w:r>
+            <w:hyperlink r:id="rId44" w:anchor="RF010" w:history="1">
+              <w:r>
+                <w:rPr>
+                  <w:rStyle w:val="Hyperlink"/>
+                  <w:szCs w:val="24"/>
+                </w:rPr>
+                <w:t>RF010</w:t>
+              </w:r>
+            </w:hyperlink>
+            <w:r>
+              <w:t xml:space="preserve">, </w:t>
+            </w:r>
+            <w:hyperlink r:id="rId45" w:anchor="RN025" w:history="1">
+              <w:r>
+                <w:rPr>
+                  <w:rStyle w:val="Hyperlink"/>
+                  <w:szCs w:val="24"/>
+                </w:rPr>
+                <w:t>RN025</w:t>
+              </w:r>
+            </w:hyperlink>
+            <w:r>
+              <w:t xml:space="preserve">, </w:t>
+            </w:r>
+            <w:hyperlink r:id="rId46" w:anchor="RS004" w:history="1">
+              <w:r>
+                <w:rPr>
+                  <w:rStyle w:val="Hyperlink"/>
+                  <w:szCs w:val="24"/>
+                </w:rPr>
+                <w:t>RS004</w:t>
+              </w:r>
+            </w:hyperlink>
+            <w:r>
+              <w:t xml:space="preserve">, </w:t>
+            </w:r>
+            <w:hyperlink r:id="rId47" w:anchor="RS010" w:history="1">
+              <w:r>
+                <w:rPr>
+                  <w:rStyle w:val="Hyperlink"/>
+                  <w:szCs w:val="24"/>
+                </w:rPr>
+                <w:t>RS010</w:t>
+              </w:r>
+            </w:hyperlink>
+            <w:r>
+              <w:t>).</w:t>
+            </w:r>
+          </w:p>
+        </w:tc>
+      </w:tr>
+      <w:tr>
+        <w:trPr>
+          <w:cantSplit/>
+        </w:trPr>
+        <w:tc>
+          <w:tcPr>
+            <w:tcW w:w="2300" w:type="dxa"/>
+          </w:tcPr>
+          <w:p>
+            <w:pPr>
+              <w:pStyle w:val="TextodeTabela"/>
+            </w:pPr>
+            <w:r>
+              <w:t>Formatação</w:t>
+            </w:r>
+          </w:p>
+        </w:tc>
+        <w:tc>
+          <w:tcPr>
+            <w:tcW w:w="6771" w:type="dxa"/>
+          </w:tcPr>
+          <w:p>
+            <w:pPr>
+              <w:pStyle w:val="TextodeTabela"/>
+            </w:pPr>
+            <w:r>
+              <w:t>Telefone celular e fixo, durante a digitação e já formatado; moeda, inclusive zero, e a leitura do campo monetário; data de um instante no fuso da empresa, perto da meia-noite, e data de calendário; data e hora; duração com e sem horas ou minutos; CNPJ durante a digitação e alfanumérico; links de telefone e de WhatsApp; ano no fuso da empresa (</w:t>
+            </w:r>
+            <w:hyperlink r:id="rId48" w:anchor="RN035" w:history="1">
+              <w:r>
+                <w:rPr>
+                  <w:rStyle w:val="Hyperlink"/>
+                  <w:szCs w:val="24"/>
+                </w:rPr>
+                <w:t>RN035</w:t>
+              </w:r>
+            </w:hyperlink>
+            <w:r>
+              <w:t xml:space="preserve">, </w:t>
+            </w:r>
+            <w:hyperlink r:id="rId49" w:anchor="RNF016" w:history="1">
+              <w:r>
+                <w:rPr>
+                  <w:rStyle w:val="Hyperlink"/>
+                  <w:szCs w:val="24"/>
+                </w:rPr>
+                <w:t>RNF016</w:t>
+              </w:r>
+            </w:hyperlink>
+            <w:r>
+              <w:t>).</w:t>
+            </w:r>
+          </w:p>
+        </w:tc>
+      </w:tr>
     </w:tbl>
     <w:p>
       <w:pPr>
@@ -11802,7 +12365,6 @@
         <w:keepNext/>
       </w:pPr>
       <w:r>
-        <w:lastRenderedPageBreak/>
         <w:t>Como os testes também são escritos com o auxílio da IA, valem as regras a seguir:</w:t>
       </w:r>
     </w:p>
@@ -11873,6 +12435,7 @@
         </w:numPr>
       </w:pPr>
       <w:r>
+        <w:lastRenderedPageBreak/>
         <w:t>os testes são rápidos, independentes entre si e repetíveis: não acessam o banco nem a rede, não dependem da ordem de execução nem de esperas, e a data atual é sempre informada pelo próprio teste;</w:t>
       </w:r>
     </w:p>
@@ -11926,7 +12489,7 @@
       <w:pPr>
         <w:pStyle w:val="Ttulo2"/>
       </w:pPr>
-      <w:bookmarkStart w:id="34" w:name="_Toc243258048"/>
+      <w:bookmarkStart w:id="34" w:name="_Toc243435601"/>
       <w:r>
         <w:t>Testes Manuais</w:t>
       </w:r>
@@ -11963,6 +12526,32 @@
         <w:rPr>
           <w:i/>
           <w:iCs/>
+        </w:rPr>
+        <w:t>pull request</w:t>
+      </w:r>
+      <w:r>
+        <w:t>.</w:t>
+      </w:r>
+    </w:p>
+    <w:p>
+      <w:pPr>
+        <w:pStyle w:val="Texto"/>
+      </w:pPr>
+      <w:r>
+        <w:t xml:space="preserve">Quando a tarefa cria ou muda uma tela, um </w:t>
+      </w:r>
+      <w:r>
+        <w:rPr>
+          <w:i/>
+        </w:rPr>
+        <w:t>layout</w:t>
+      </w:r>
+      <w:r>
+        <w:t xml:space="preserve"> ou o tema, a aplicação compilada é conferida localmente no navegador, nas larguras de 360 e de 1440 pixels e nos temas claro e escuro: nada transborda da largura da tela, tudo funciona pelo teclado, e o foco fica visível. A acessibilidade é auditada com o Lighthouse, nos modos celular e computador e nos dois temas, sem auditoria reprovada, e o desenvolvedor repete a conferência na pré-visualização, com a captura de tela no </w:t>
+      </w:r>
+      <w:r>
+        <w:rPr>
+          <w:i/>
         </w:rPr>
         <w:t>pull request</w:t>
       </w:r>
@@ -12027,11 +12616,7 @@
         <w:t>next.config.ts</w:t>
       </w:r>
       <w:r>
-        <w:t xml:space="preserve">, as dependências ou a leitura de variáveis de ambiente, a aplicação </w:t>
-      </w:r>
-      <w:r>
-        <w:lastRenderedPageBreak/>
-        <w:t xml:space="preserve">compilada também é conferida no contêiner, com </w:t>
+        <w:t xml:space="preserve">, as dependências ou a leitura de variáveis de ambiente, a aplicação compilada também é conferida no contêiner, com </w:t>
       </w:r>
       <w:r>
         <w:rPr>
@@ -12060,8 +12645,9 @@
       <w:pPr>
         <w:pStyle w:val="Ttulo2"/>
       </w:pPr>
-      <w:bookmarkStart w:id="35" w:name="_Toc243258049"/>
-      <w:r>
+      <w:bookmarkStart w:id="35" w:name="_Toc243435602"/>
+      <w:r>
+        <w:lastRenderedPageBreak/>
         <w:t>Critérios de Pronto</w:t>
       </w:r>
       <w:bookmarkEnd w:id="35"/>
@@ -12212,7 +12798,7 @@
       <w:pPr>
         <w:pStyle w:val="Ttulo2"/>
       </w:pPr>
-      <w:bookmarkStart w:id="36" w:name="_Toc243258050"/>
+      <w:bookmarkStart w:id="36" w:name="_Toc243435603"/>
       <w:r>
         <w:t>Registro de Defeitos</w:t>
       </w:r>
@@ -12251,7 +12837,7 @@
       <w:pPr>
         <w:pStyle w:val="Ttulo1"/>
       </w:pPr>
-      <w:bookmarkStart w:id="37" w:name="_Toc243258051"/>
+      <w:bookmarkStart w:id="37" w:name="_Toc243435604"/>
       <w:r>
         <w:lastRenderedPageBreak/>
         <w:t>FERRAMENTAS</w:t>
@@ -12805,7 +13391,7 @@
         </w:numPr>
         <w:jc w:val="center"/>
       </w:pPr>
-      <w:bookmarkStart w:id="38" w:name="_Toc243258052"/>
+      <w:bookmarkStart w:id="38" w:name="_Toc243435605"/>
       <w:r>
         <w:lastRenderedPageBreak/>
         <w:t>REFERÊNCIAS</w:t>
@@ -12885,7 +13471,7 @@
       </w:r>
     </w:p>
     <w:sectPr>
-      <w:headerReference w:type="default" r:id="rId37"/>
+      <w:headerReference w:type="default" r:id="rId50"/>
       <w:pgSz w:w="11906" w:h="16838"/>
       <w:pgMar w:top="1701" w:right="1134" w:bottom="1134" w:left="1701" w:header="709" w:footer="709" w:gutter="0"/>
       <w:cols w:space="708"/>
@@ -14252,6 +14838,18 @@
       <w:szCs w:val="18"/>
     </w:rPr>
   </w:style>
+  <w:style w:type="character" w:styleId="MenoPendente">
+    <w:name w:val="Unresolved Mention"/>
+    <w:basedOn w:val="Fontepargpadro"/>
+    <w:uiPriority w:val="99"/>
+    <w:semiHidden/>
+    <w:unhideWhenUsed/>
+    <w:rsid w:val="00801C2A"/>
+    <w:rPr>
+      <w:color w:val="605E5C"/>
+      <w:shd w:val="clear" w:color="auto" w:fill="E1DFDD"/>
+    </w:rPr>
+  </w:style>
 </w:styles>
 </file>
 

</xml_diff>